<commit_message>
Practice Use Case edits
</commit_message>
<xml_diff>
--- a/en/data-mobilization/modules/ROOT/attachments/UC-Practice-exercise-sheet_EN.docx
+++ b/en/data-mobilization/modules/ROOT/attachments/UC-Practice-exercise-sheet_EN.docx
@@ -1401,6 +1401,601 @@
     </w:p>
     <w:p>
       <w:pPr>
+        <w:pStyle w:val="NormalWeb"/>
+        <w:shd w:val="clear" w:color="auto" w:fill="FFFFFF"/>
+        <w:spacing w:before="0" w:beforeAutospacing="0" w:after="0" w:afterAutospacing="0"/>
+        <w:rPr>
+          <w:rStyle w:val="Strong"/>
+          <w:rFonts w:ascii="Arial" w:hAnsi="Arial" w:cs="Arial"/>
+          <w:color w:val="333333"/>
+          <w:sz w:val="20"/>
+          <w:szCs w:val="20"/>
+        </w:rPr>
+      </w:pPr>
+    </w:p>
+    <w:p>
+      <w:pPr>
+        <w:pStyle w:val="NormalWeb"/>
+        <w:shd w:val="clear" w:color="auto" w:fill="FFFFFF"/>
+        <w:spacing w:before="0" w:beforeAutospacing="0" w:after="0" w:afterAutospacing="0"/>
+        <w:rPr>
+          <w:rFonts w:ascii="Arial" w:hAnsi="Arial" w:cs="Arial"/>
+          <w:color w:val="333333"/>
+          <w:sz w:val="20"/>
+          <w:szCs w:val="20"/>
+        </w:rPr>
+      </w:pPr>
+      <w:r>
+        <w:rPr>
+          <w:rStyle w:val="Strong"/>
+          <w:rFonts w:ascii="Arial" w:hAnsi="Arial" w:cs="Arial"/>
+          <w:color w:val="333333"/>
+          <w:sz w:val="20"/>
+          <w:szCs w:val="20"/>
+        </w:rPr>
+        <w:t>Technical errors</w:t>
+      </w:r>
+      <w:r>
+        <w:rPr>
+          <w:rStyle w:val="Strong"/>
+          <w:rFonts w:ascii="Arial" w:hAnsi="Arial" w:cs="Arial"/>
+          <w:color w:val="333333"/>
+          <w:sz w:val="20"/>
+          <w:szCs w:val="20"/>
+        </w:rPr>
+        <w:t>:</w:t>
+      </w:r>
+      <w:r>
+        <w:rPr>
+          <w:rFonts w:ascii="Arial" w:hAnsi="Arial" w:cs="Arial"/>
+          <w:color w:val="333333"/>
+          <w:sz w:val="20"/>
+          <w:szCs w:val="20"/>
+        </w:rPr>
+        <w:t> Relatively simple, often able to be automated, </w:t>
+      </w:r>
+      <w:r>
+        <w:rPr>
+          <w:rStyle w:val="Strong"/>
+          <w:rFonts w:ascii="Arial" w:hAnsi="Arial" w:cs="Arial"/>
+          <w:color w:val="333333"/>
+          <w:sz w:val="20"/>
+          <w:szCs w:val="20"/>
+        </w:rPr>
+        <w:t>checks against the integrity of the data</w:t>
+      </w:r>
+      <w:r>
+        <w:rPr>
+          <w:rFonts w:ascii="Arial" w:hAnsi="Arial" w:cs="Arial"/>
+          <w:color w:val="333333"/>
+          <w:sz w:val="20"/>
+          <w:szCs w:val="20"/>
+        </w:rPr>
+        <w:t>. These may indicate incorrect exports, data mapping, field slippage (e.g. moving 1 column to the right) or data missing at the source.</w:t>
+      </w:r>
+    </w:p>
+    <w:p>
+      <w:pPr>
+        <w:pStyle w:val="NormalWeb"/>
+        <w:shd w:val="clear" w:color="auto" w:fill="FFFFFF"/>
+        <w:spacing w:before="0" w:beforeAutospacing="0" w:after="0" w:afterAutospacing="0"/>
+        <w:rPr>
+          <w:rFonts w:ascii="Arial" w:hAnsi="Arial" w:cs="Arial"/>
+          <w:color w:val="333333"/>
+          <w:sz w:val="20"/>
+          <w:szCs w:val="20"/>
+        </w:rPr>
+      </w:pPr>
+    </w:p>
+    <w:p>
+      <w:pPr>
+        <w:pStyle w:val="NormalWeb"/>
+        <w:numPr>
+          <w:ilvl w:val="0"/>
+          <w:numId w:val="1"/>
+        </w:numPr>
+        <w:shd w:val="clear" w:color="auto" w:fill="FFFFFF"/>
+        <w:spacing w:before="0" w:beforeAutospacing="0" w:after="0" w:afterAutospacing="0"/>
+        <w:rPr>
+          <w:rFonts w:ascii="Arial" w:hAnsi="Arial" w:cs="Arial"/>
+          <w:color w:val="333333"/>
+          <w:sz w:val="20"/>
+          <w:szCs w:val="20"/>
+        </w:rPr>
+      </w:pPr>
+      <w:r>
+        <w:rPr>
+          <w:rStyle w:val="Strong"/>
+          <w:rFonts w:ascii="Arial" w:hAnsi="Arial" w:cs="Arial"/>
+          <w:color w:val="333333"/>
+          <w:sz w:val="20"/>
+          <w:szCs w:val="20"/>
+        </w:rPr>
+        <w:t>Completeness</w:t>
+      </w:r>
+      <w:r>
+        <w:rPr>
+          <w:rFonts w:ascii="Arial" w:hAnsi="Arial" w:cs="Arial"/>
+          <w:color w:val="333333"/>
+          <w:sz w:val="20"/>
+          <w:szCs w:val="20"/>
+        </w:rPr>
+        <w:t xml:space="preserve">: Whether all the data and metadata </w:t>
+      </w:r>
+      <w:r>
+        <w:rPr>
+          <w:rFonts w:ascii="Arial" w:hAnsi="Arial" w:cs="Arial"/>
+          <w:color w:val="333333"/>
+          <w:sz w:val="20"/>
+          <w:szCs w:val="20"/>
+        </w:rPr>
+        <w:t>are</w:t>
+      </w:r>
+      <w:r>
+        <w:rPr>
+          <w:rFonts w:ascii="Arial" w:hAnsi="Arial" w:cs="Arial"/>
+          <w:color w:val="333333"/>
+          <w:sz w:val="20"/>
+          <w:szCs w:val="20"/>
+        </w:rPr>
+        <w:t xml:space="preserve"> available – are all fields present, are all fields filled out?</w:t>
+      </w:r>
+    </w:p>
+    <w:p>
+      <w:pPr>
+        <w:pStyle w:val="NormalWeb"/>
+        <w:numPr>
+          <w:ilvl w:val="0"/>
+          <w:numId w:val="1"/>
+        </w:numPr>
+        <w:shd w:val="clear" w:color="auto" w:fill="FFFFFF"/>
+        <w:spacing w:before="0" w:beforeAutospacing="0" w:after="0" w:afterAutospacing="0"/>
+        <w:rPr>
+          <w:rFonts w:ascii="Arial" w:hAnsi="Arial" w:cs="Arial"/>
+          <w:color w:val="333333"/>
+          <w:sz w:val="20"/>
+          <w:szCs w:val="20"/>
+        </w:rPr>
+      </w:pPr>
+      <w:r>
+        <w:rPr>
+          <w:rStyle w:val="Strong"/>
+          <w:rFonts w:ascii="Arial" w:hAnsi="Arial" w:cs="Arial"/>
+          <w:color w:val="333333"/>
+          <w:sz w:val="20"/>
+          <w:szCs w:val="20"/>
+        </w:rPr>
+        <w:t>Bounds</w:t>
+      </w:r>
+      <w:r>
+        <w:rPr>
+          <w:rFonts w:ascii="Arial" w:hAnsi="Arial" w:cs="Arial"/>
+          <w:color w:val="333333"/>
+          <w:sz w:val="20"/>
+          <w:szCs w:val="20"/>
+        </w:rPr>
+        <w:t>: For example, are days given in the range 1-31 (depending on month)</w:t>
+      </w:r>
+    </w:p>
+    <w:p>
+      <w:pPr>
+        <w:pStyle w:val="NormalWeb"/>
+        <w:numPr>
+          <w:ilvl w:val="0"/>
+          <w:numId w:val="1"/>
+        </w:numPr>
+        <w:shd w:val="clear" w:color="auto" w:fill="FFFFFF"/>
+        <w:spacing w:before="0" w:beforeAutospacing="0" w:after="0" w:afterAutospacing="0"/>
+        <w:rPr>
+          <w:rFonts w:ascii="Arial" w:hAnsi="Arial" w:cs="Arial"/>
+          <w:color w:val="333333"/>
+          <w:sz w:val="20"/>
+          <w:szCs w:val="20"/>
+        </w:rPr>
+      </w:pPr>
+      <w:r>
+        <w:rPr>
+          <w:rStyle w:val="Strong"/>
+          <w:rFonts w:ascii="Arial" w:hAnsi="Arial" w:cs="Arial"/>
+          <w:color w:val="333333"/>
+          <w:sz w:val="20"/>
+          <w:szCs w:val="20"/>
+        </w:rPr>
+        <w:t>Data type</w:t>
+      </w:r>
+      <w:r>
+        <w:rPr>
+          <w:rFonts w:ascii="Arial" w:hAnsi="Arial" w:cs="Arial"/>
+          <w:color w:val="333333"/>
+          <w:sz w:val="20"/>
+          <w:szCs w:val="20"/>
+        </w:rPr>
+        <w:t>: For example, does the Date field contain a date or a number?</w:t>
+      </w:r>
+    </w:p>
+    <w:p>
+      <w:pPr>
+        <w:pStyle w:val="NormalWeb"/>
+        <w:numPr>
+          <w:ilvl w:val="0"/>
+          <w:numId w:val="1"/>
+        </w:numPr>
+        <w:shd w:val="clear" w:color="auto" w:fill="FFFFFF"/>
+        <w:spacing w:before="0" w:beforeAutospacing="0" w:after="0" w:afterAutospacing="0"/>
+        <w:rPr>
+          <w:rFonts w:ascii="Helvetica Neue" w:hAnsi="Helvetica Neue"/>
+          <w:color w:val="333333"/>
+          <w:sz w:val="26"/>
+          <w:szCs w:val="26"/>
+        </w:rPr>
+      </w:pPr>
+      <w:r>
+        <w:rPr>
+          <w:rStyle w:val="Strong"/>
+          <w:rFonts w:ascii="Arial" w:hAnsi="Arial" w:cs="Arial"/>
+          <w:color w:val="333333"/>
+          <w:sz w:val="20"/>
+          <w:szCs w:val="20"/>
+        </w:rPr>
+        <w:t>Data format</w:t>
+      </w:r>
+      <w:r>
+        <w:rPr>
+          <w:rFonts w:ascii="Arial" w:hAnsi="Arial" w:cs="Arial"/>
+          <w:color w:val="333333"/>
+          <w:sz w:val="20"/>
+          <w:szCs w:val="20"/>
+        </w:rPr>
+        <w:t>: For example, are Dates provided as 01/01/2010 or 01/Jan/10?</w:t>
+      </w:r>
+    </w:p>
+    <w:p>
+      <w:pPr>
+        <w:pStyle w:val="NormalWeb"/>
+        <w:shd w:val="clear" w:color="auto" w:fill="FFFFFF"/>
+        <w:spacing w:before="0" w:beforeAutospacing="0" w:after="0" w:afterAutospacing="0"/>
+        <w:rPr>
+          <w:rStyle w:val="Strong"/>
+          <w:rFonts w:ascii="Arial" w:hAnsi="Arial" w:cs="Arial"/>
+          <w:color w:val="333333"/>
+          <w:sz w:val="20"/>
+          <w:szCs w:val="20"/>
+        </w:rPr>
+      </w:pPr>
+    </w:p>
+    <w:p>
+      <w:pPr>
+        <w:pStyle w:val="NormalWeb"/>
+        <w:shd w:val="clear" w:color="auto" w:fill="FFFFFF"/>
+        <w:spacing w:before="0" w:beforeAutospacing="0" w:after="0" w:afterAutospacing="0"/>
+        <w:rPr>
+          <w:rFonts w:ascii="Arial" w:hAnsi="Arial" w:cs="Arial"/>
+          <w:color w:val="333333"/>
+          <w:sz w:val="20"/>
+          <w:szCs w:val="20"/>
+        </w:rPr>
+      </w:pPr>
+      <w:r>
+        <w:rPr>
+          <w:rStyle w:val="Strong"/>
+          <w:rFonts w:ascii="Arial" w:hAnsi="Arial" w:cs="Arial"/>
+          <w:color w:val="333333"/>
+          <w:sz w:val="20"/>
+          <w:szCs w:val="20"/>
+        </w:rPr>
+        <w:t>Consistency errors</w:t>
+      </w:r>
+      <w:r>
+        <w:rPr>
+          <w:rStyle w:val="Strong"/>
+          <w:rFonts w:ascii="Arial" w:hAnsi="Arial" w:cs="Arial"/>
+          <w:color w:val="333333"/>
+          <w:sz w:val="20"/>
+          <w:szCs w:val="20"/>
+        </w:rPr>
+        <w:t>:</w:t>
+      </w:r>
+      <w:r>
+        <w:rPr>
+          <w:rFonts w:ascii="Arial" w:hAnsi="Arial" w:cs="Arial"/>
+          <w:color w:val="333333"/>
+          <w:sz w:val="20"/>
+          <w:szCs w:val="20"/>
+        </w:rPr>
+        <w:t xml:space="preserve"> </w:t>
+      </w:r>
+      <w:r>
+        <w:rPr>
+          <w:rFonts w:ascii="Arial" w:hAnsi="Arial" w:cs="Arial"/>
+          <w:color w:val="333333"/>
+          <w:sz w:val="20"/>
+          <w:szCs w:val="20"/>
+        </w:rPr>
+        <w:t>Application of real-world rules to the data. These may indicate incorrect data entry from older records, transcription errors or post processing. Some are complex to implement and </w:t>
+      </w:r>
+      <w:r>
+        <w:rPr>
+          <w:rStyle w:val="Strong"/>
+          <w:rFonts w:ascii="Arial" w:hAnsi="Arial" w:cs="Arial"/>
+          <w:color w:val="333333"/>
+          <w:sz w:val="20"/>
+          <w:szCs w:val="20"/>
+        </w:rPr>
+        <w:t>require reference data sets to check against</w:t>
+      </w:r>
+      <w:r>
+        <w:rPr>
+          <w:rFonts w:ascii="Arial" w:hAnsi="Arial" w:cs="Arial"/>
+          <w:color w:val="333333"/>
+          <w:sz w:val="20"/>
+          <w:szCs w:val="20"/>
+        </w:rPr>
+        <w:t>. E.g. a list of known collectors and collecting habits. These rules can be gathered from data users and analysts.</w:t>
+      </w:r>
+    </w:p>
+    <w:p>
+      <w:pPr>
+        <w:pStyle w:val="NormalWeb"/>
+        <w:numPr>
+          <w:ilvl w:val="0"/>
+          <w:numId w:val="2"/>
+        </w:numPr>
+        <w:shd w:val="clear" w:color="auto" w:fill="FFFFFF"/>
+        <w:spacing w:before="0" w:beforeAutospacing="0" w:after="0" w:afterAutospacing="0"/>
+        <w:rPr>
+          <w:rFonts w:ascii="Arial" w:hAnsi="Arial" w:cs="Arial"/>
+          <w:color w:val="333333"/>
+          <w:sz w:val="20"/>
+          <w:szCs w:val="20"/>
+        </w:rPr>
+      </w:pPr>
+      <w:r>
+        <w:rPr>
+          <w:rStyle w:val="Strong"/>
+          <w:rFonts w:ascii="Arial" w:hAnsi="Arial" w:cs="Arial"/>
+          <w:color w:val="333333"/>
+          <w:sz w:val="20"/>
+          <w:szCs w:val="20"/>
+        </w:rPr>
+        <w:t>Taxonomic</w:t>
+      </w:r>
+      <w:r>
+        <w:rPr>
+          <w:rFonts w:ascii="Arial" w:hAnsi="Arial" w:cs="Arial"/>
+          <w:color w:val="333333"/>
+          <w:sz w:val="20"/>
+          <w:szCs w:val="20"/>
+        </w:rPr>
+        <w:t>: For example, if identified to species level, have a binomial scientific name and entries in genus and species fields been provided?</w:t>
+      </w:r>
+      <w:r>
+        <w:rPr>
+          <w:rFonts w:ascii="Arial" w:hAnsi="Arial" w:cs="Arial"/>
+          <w:color w:val="333333"/>
+          <w:sz w:val="20"/>
+          <w:szCs w:val="20"/>
+        </w:rPr>
+        <w:t xml:space="preserve"> Are they spelled correctly?</w:t>
+      </w:r>
+    </w:p>
+    <w:p>
+      <w:pPr>
+        <w:pStyle w:val="NormalWeb"/>
+        <w:numPr>
+          <w:ilvl w:val="0"/>
+          <w:numId w:val="2"/>
+        </w:numPr>
+        <w:shd w:val="clear" w:color="auto" w:fill="FFFFFF"/>
+        <w:spacing w:before="0" w:beforeAutospacing="0" w:after="0" w:afterAutospacing="0"/>
+        <w:rPr>
+          <w:rFonts w:ascii="Arial" w:hAnsi="Arial" w:cs="Arial"/>
+          <w:color w:val="333333"/>
+          <w:sz w:val="20"/>
+          <w:szCs w:val="20"/>
+        </w:rPr>
+      </w:pPr>
+      <w:r>
+        <w:rPr>
+          <w:rStyle w:val="Strong"/>
+          <w:rFonts w:ascii="Arial" w:hAnsi="Arial" w:cs="Arial"/>
+          <w:color w:val="333333"/>
+          <w:sz w:val="20"/>
+          <w:szCs w:val="20"/>
+        </w:rPr>
+        <w:t>Currency</w:t>
+      </w:r>
+      <w:r>
+        <w:rPr>
+          <w:rFonts w:ascii="Arial" w:hAnsi="Arial" w:cs="Arial"/>
+          <w:color w:val="333333"/>
+          <w:sz w:val="20"/>
+          <w:szCs w:val="20"/>
+        </w:rPr>
+        <w:t>: Are dates of collection, identification, update and digitization consistent?</w:t>
+      </w:r>
+    </w:p>
+    <w:p>
+      <w:pPr>
+        <w:pStyle w:val="NormalWeb"/>
+        <w:numPr>
+          <w:ilvl w:val="0"/>
+          <w:numId w:val="2"/>
+        </w:numPr>
+        <w:shd w:val="clear" w:color="auto" w:fill="FFFFFF"/>
+        <w:spacing w:before="0" w:beforeAutospacing="0" w:after="0" w:afterAutospacing="0"/>
+        <w:rPr>
+          <w:rFonts w:ascii="Arial" w:hAnsi="Arial" w:cs="Arial"/>
+          <w:color w:val="333333"/>
+          <w:sz w:val="20"/>
+          <w:szCs w:val="20"/>
+        </w:rPr>
+      </w:pPr>
+      <w:r>
+        <w:rPr>
+          <w:rStyle w:val="Strong"/>
+          <w:rFonts w:ascii="Arial" w:hAnsi="Arial" w:cs="Arial"/>
+          <w:color w:val="333333"/>
+          <w:sz w:val="20"/>
+          <w:szCs w:val="20"/>
+        </w:rPr>
+        <w:t>Outliers</w:t>
+      </w:r>
+      <w:r>
+        <w:rPr>
+          <w:rFonts w:ascii="Arial" w:hAnsi="Arial" w:cs="Arial"/>
+          <w:color w:val="333333"/>
+          <w:sz w:val="20"/>
+          <w:szCs w:val="20"/>
+        </w:rPr>
+        <w:t>: Detect outliers, but remember that not all outliers are necessarily errors. For example, compare against a known species range, or known environmental range (but remember that outliers may be misidentifications, rather than incorrect coordinates).</w:t>
+      </w:r>
+    </w:p>
+    <w:p>
+      <w:pPr>
+        <w:pStyle w:val="NormalWeb"/>
+        <w:numPr>
+          <w:ilvl w:val="0"/>
+          <w:numId w:val="2"/>
+        </w:numPr>
+        <w:shd w:val="clear" w:color="auto" w:fill="FFFFFF"/>
+        <w:spacing w:before="0" w:beforeAutospacing="0" w:after="0" w:afterAutospacing="0"/>
+        <w:rPr>
+          <w:rFonts w:ascii="Arial" w:hAnsi="Arial" w:cs="Arial"/>
+          <w:color w:val="333333"/>
+          <w:sz w:val="20"/>
+          <w:szCs w:val="20"/>
+        </w:rPr>
+      </w:pPr>
+      <w:r>
+        <w:rPr>
+          <w:rStyle w:val="Strong"/>
+          <w:rFonts w:ascii="Arial" w:hAnsi="Arial" w:cs="Arial"/>
+          <w:color w:val="333333"/>
+          <w:sz w:val="20"/>
+          <w:szCs w:val="20"/>
+        </w:rPr>
+        <w:t>Geographic</w:t>
+      </w:r>
+      <w:r>
+        <w:rPr>
+          <w:rFonts w:ascii="Arial" w:hAnsi="Arial" w:cs="Arial"/>
+          <w:color w:val="333333"/>
+          <w:sz w:val="20"/>
+          <w:szCs w:val="20"/>
+        </w:rPr>
+        <w:t>: Are the coordinates within the identified locality or region? For example, are there any terrestrial occurrences in the sea or marine occurrences on land?</w:t>
+      </w:r>
+    </w:p>
+    <w:p>
+      <w:pPr>
+        <w:pStyle w:val="NormalWeb"/>
+        <w:numPr>
+          <w:ilvl w:val="0"/>
+          <w:numId w:val="2"/>
+        </w:numPr>
+        <w:shd w:val="clear" w:color="auto" w:fill="FFFFFF"/>
+        <w:spacing w:before="0" w:beforeAutospacing="0" w:after="0" w:afterAutospacing="0"/>
+        <w:rPr>
+          <w:rFonts w:ascii="Arial" w:hAnsi="Arial" w:cs="Arial"/>
+          <w:color w:val="333333"/>
+          <w:sz w:val="20"/>
+          <w:szCs w:val="20"/>
+        </w:rPr>
+      </w:pPr>
+      <w:r>
+        <w:rPr>
+          <w:rStyle w:val="Strong"/>
+          <w:rFonts w:ascii="Arial" w:hAnsi="Arial" w:cs="Arial"/>
+          <w:color w:val="333333"/>
+          <w:sz w:val="20"/>
+          <w:szCs w:val="20"/>
+        </w:rPr>
+        <w:t>Collecting patterns</w:t>
+      </w:r>
+      <w:r>
+        <w:rPr>
+          <w:rFonts w:ascii="Arial" w:hAnsi="Arial" w:cs="Arial"/>
+          <w:color w:val="333333"/>
+          <w:sz w:val="20"/>
+          <w:szCs w:val="20"/>
+        </w:rPr>
+        <w:t>: Does the occurrence detail match the known collecting patterns of the organization or collector? Do any records appear to have been created after a collector has died (could this possibly be a different collector with a similar name)? For example, are any mammal records attributed to a bird watching group?</w:t>
+      </w:r>
+    </w:p>
+    <w:p>
+      <w:pPr>
+        <w:pStyle w:val="NormalWeb"/>
+        <w:numPr>
+          <w:ilvl w:val="0"/>
+          <w:numId w:val="2"/>
+        </w:numPr>
+        <w:shd w:val="clear" w:color="auto" w:fill="FFFFFF"/>
+        <w:spacing w:before="0" w:beforeAutospacing="0" w:after="0" w:afterAutospacing="0"/>
+        <w:rPr>
+          <w:rFonts w:ascii="Arial" w:hAnsi="Arial" w:cs="Arial"/>
+          <w:color w:val="333333"/>
+          <w:sz w:val="20"/>
+          <w:szCs w:val="20"/>
+        </w:rPr>
+      </w:pPr>
+      <w:r>
+        <w:rPr>
+          <w:rStyle w:val="Strong"/>
+          <w:rFonts w:ascii="Arial" w:hAnsi="Arial" w:cs="Arial"/>
+          <w:color w:val="333333"/>
+          <w:sz w:val="20"/>
+          <w:szCs w:val="20"/>
+        </w:rPr>
+        <w:t>Accuracy and precision</w:t>
+      </w:r>
+      <w:r>
+        <w:rPr>
+          <w:rFonts w:ascii="Arial" w:hAnsi="Arial" w:cs="Arial"/>
+          <w:color w:val="333333"/>
+          <w:sz w:val="20"/>
+          <w:szCs w:val="20"/>
+        </w:rPr>
+        <w:t>: For example, are any georeferenced records indicating very high precision or accuracy from a pre-GPS (or pre-accurate GPS) collecting period?</w:t>
+      </w:r>
+    </w:p>
+    <w:p>
+      <w:pPr>
+        <w:pStyle w:val="NormalWeb"/>
+        <w:numPr>
+          <w:ilvl w:val="0"/>
+          <w:numId w:val="2"/>
+        </w:numPr>
+        <w:shd w:val="clear" w:color="auto" w:fill="FFFFFF"/>
+        <w:spacing w:before="0" w:beforeAutospacing="0" w:after="0" w:afterAutospacing="0"/>
+        <w:rPr>
+          <w:rFonts w:ascii="Arial" w:hAnsi="Arial" w:cs="Arial"/>
+          <w:color w:val="333333"/>
+          <w:sz w:val="20"/>
+          <w:szCs w:val="20"/>
+        </w:rPr>
+      </w:pPr>
+      <w:r>
+        <w:rPr>
+          <w:rStyle w:val="Strong"/>
+          <w:rFonts w:ascii="Arial" w:hAnsi="Arial" w:cs="Arial"/>
+          <w:color w:val="333333"/>
+          <w:sz w:val="20"/>
+          <w:szCs w:val="20"/>
+        </w:rPr>
+        <w:t>Collecting methods</w:t>
+      </w:r>
+      <w:r>
+        <w:rPr>
+          <w:rFonts w:ascii="Arial" w:hAnsi="Arial" w:cs="Arial"/>
+          <w:color w:val="333333"/>
+          <w:sz w:val="20"/>
+          <w:szCs w:val="20"/>
+        </w:rPr>
+        <w:t>: Different survey methods (e.g. transects and area surveys) have particular characteristics. Are the records consistent with the method provided?</w:t>
+      </w:r>
+    </w:p>
+    <w:p>
+      <w:pPr>
         <w:spacing w:after="0"/>
         <w:rPr>
           <w:b/>
@@ -1423,11 +2018,11 @@
         <w:tblLook w:val="0600" w:firstRow="0" w:lastRow="0" w:firstColumn="0" w:lastColumn="0" w:noHBand="1" w:noVBand="1"/>
       </w:tblPr>
       <w:tblGrid>
-        <w:gridCol w:w="1480"/>
-        <w:gridCol w:w="3135"/>
-        <w:gridCol w:w="3225"/>
-        <w:gridCol w:w="1180"/>
-        <w:gridCol w:w="1540"/>
+        <w:gridCol w:w="1520"/>
+        <w:gridCol w:w="3150"/>
+        <w:gridCol w:w="3420"/>
+        <w:gridCol w:w="1170"/>
+        <w:gridCol w:w="1300"/>
       </w:tblGrid>
       <w:tr>
         <w:trPr>
@@ -1471,7 +2066,7 @@
         </w:trPr>
         <w:tc>
           <w:tcPr>
-            <w:tcW w:w="1480" w:type="dxa"/>
+            <w:tcW w:w="1520" w:type="dxa"/>
             <w:tcMar>
               <w:top w:w="100" w:type="dxa"/>
               <w:left w:w="100" w:type="dxa"/>
@@ -1503,7 +2098,7 @@
         </w:tc>
         <w:tc>
           <w:tcPr>
-            <w:tcW w:w="3135" w:type="dxa"/>
+            <w:tcW w:w="3150" w:type="dxa"/>
             <w:tcMar>
               <w:top w:w="100" w:type="dxa"/>
               <w:left w:w="100" w:type="dxa"/>
@@ -1535,7 +2130,7 @@
         </w:tc>
         <w:tc>
           <w:tcPr>
-            <w:tcW w:w="3225" w:type="dxa"/>
+            <w:tcW w:w="3420" w:type="dxa"/>
             <w:tcMar>
               <w:top w:w="100" w:type="dxa"/>
               <w:left w:w="100" w:type="dxa"/>
@@ -1567,7 +2162,7 @@
         </w:tc>
         <w:tc>
           <w:tcPr>
-            <w:tcW w:w="1180" w:type="dxa"/>
+            <w:tcW w:w="1170" w:type="dxa"/>
             <w:tcMar>
               <w:top w:w="100" w:type="dxa"/>
               <w:left w:w="100" w:type="dxa"/>
@@ -1599,7 +2194,7 @@
         </w:tc>
         <w:tc>
           <w:tcPr>
-            <w:tcW w:w="1540" w:type="dxa"/>
+            <w:tcW w:w="1300" w:type="dxa"/>
             <w:tcMar>
               <w:top w:w="100" w:type="dxa"/>
               <w:left w:w="100" w:type="dxa"/>
@@ -1636,7 +2231,7 @@
         </w:trPr>
         <w:tc>
           <w:tcPr>
-            <w:tcW w:w="1480" w:type="dxa"/>
+            <w:tcW w:w="1520" w:type="dxa"/>
             <w:tcMar>
               <w:top w:w="100" w:type="dxa"/>
               <w:left w:w="100" w:type="dxa"/>
@@ -1668,18 +2263,20 @@
         </w:tc>
         <w:tc>
           <w:tcPr>
-            <w:tcW w:w="3135" w:type="dxa"/>
-            <w:tcMar>
-              <w:top w:w="100" w:type="dxa"/>
-              <w:left w:w="100" w:type="dxa"/>
-              <w:bottom w:w="100" w:type="dxa"/>
-              <w:right w:w="100" w:type="dxa"/>
-            </w:tcMar>
-          </w:tcPr>
-          <w:p>
-            <w:pPr>
-              <w:widowControl w:val="0"/>
-              <w:spacing w:after="0" w:line="240" w:lineRule="auto"/>
+            <w:tcW w:w="3150" w:type="dxa"/>
+            <w:tcMar>
+              <w:top w:w="100" w:type="dxa"/>
+              <w:left w:w="100" w:type="dxa"/>
+              <w:bottom w:w="100" w:type="dxa"/>
+              <w:right w:w="100" w:type="dxa"/>
+            </w:tcMar>
+            <w:vAlign w:val="center"/>
+          </w:tcPr>
+          <w:p>
+            <w:pPr>
+              <w:widowControl w:val="0"/>
+              <w:spacing w:after="0" w:line="240" w:lineRule="auto"/>
+              <w:jc w:val="center"/>
               <w:rPr>
                 <w:sz w:val="18"/>
                 <w:szCs w:val="18"/>
@@ -1696,7 +2293,7 @@
         </w:tc>
         <w:tc>
           <w:tcPr>
-            <w:tcW w:w="3225" w:type="dxa"/>
+            <w:tcW w:w="3420" w:type="dxa"/>
             <w:tcMar>
               <w:top w:w="100" w:type="dxa"/>
               <w:left w:w="100" w:type="dxa"/>
@@ -1718,7 +2315,7 @@
         </w:tc>
         <w:tc>
           <w:tcPr>
-            <w:tcW w:w="1180" w:type="dxa"/>
+            <w:tcW w:w="1170" w:type="dxa"/>
             <w:tcMar>
               <w:top w:w="100" w:type="dxa"/>
               <w:left w:w="100" w:type="dxa"/>
@@ -1747,7 +2344,7 @@
         </w:tc>
         <w:tc>
           <w:tcPr>
-            <w:tcW w:w="1540" w:type="dxa"/>
+            <w:tcW w:w="1300" w:type="dxa"/>
             <w:tcMar>
               <w:top w:w="100" w:type="dxa"/>
               <w:left w:w="100" w:type="dxa"/>
@@ -1774,7 +2371,7 @@
         </w:trPr>
         <w:tc>
           <w:tcPr>
-            <w:tcW w:w="1480" w:type="dxa"/>
+            <w:tcW w:w="1520" w:type="dxa"/>
             <w:tcMar>
               <w:top w:w="100" w:type="dxa"/>
               <w:left w:w="100" w:type="dxa"/>
@@ -1806,18 +2403,20 @@
         </w:tc>
         <w:tc>
           <w:tcPr>
-            <w:tcW w:w="3135" w:type="dxa"/>
-            <w:tcMar>
-              <w:top w:w="100" w:type="dxa"/>
-              <w:left w:w="100" w:type="dxa"/>
-              <w:bottom w:w="100" w:type="dxa"/>
-              <w:right w:w="100" w:type="dxa"/>
-            </w:tcMar>
-          </w:tcPr>
-          <w:p>
-            <w:pPr>
-              <w:widowControl w:val="0"/>
-              <w:spacing w:after="0" w:line="240" w:lineRule="auto"/>
+            <w:tcW w:w="3150" w:type="dxa"/>
+            <w:tcMar>
+              <w:top w:w="100" w:type="dxa"/>
+              <w:left w:w="100" w:type="dxa"/>
+              <w:bottom w:w="100" w:type="dxa"/>
+              <w:right w:w="100" w:type="dxa"/>
+            </w:tcMar>
+            <w:vAlign w:val="center"/>
+          </w:tcPr>
+          <w:p>
+            <w:pPr>
+              <w:widowControl w:val="0"/>
+              <w:spacing w:after="0" w:line="240" w:lineRule="auto"/>
+              <w:jc w:val="center"/>
               <w:rPr>
                 <w:sz w:val="18"/>
                 <w:szCs w:val="18"/>
@@ -1828,20 +2427,13 @@
                 <w:sz w:val="18"/>
                 <w:szCs w:val="18"/>
               </w:rPr>
-              <w:t>2026</w:t>
-            </w:r>
-            <w:r>
-              <w:rPr>
-                <w:sz w:val="18"/>
-                <w:szCs w:val="18"/>
-              </w:rPr>
-              <w:t xml:space="preserve"> is the current year</w:t>
-            </w:r>
-          </w:p>
-        </w:tc>
-        <w:tc>
-          <w:tcPr>
-            <w:tcW w:w="3225" w:type="dxa"/>
+              <w:t>2026 is the current year</w:t>
+            </w:r>
+          </w:p>
+        </w:tc>
+        <w:tc>
+          <w:tcPr>
+            <w:tcW w:w="3420" w:type="dxa"/>
             <w:tcMar>
               <w:top w:w="100" w:type="dxa"/>
               <w:left w:w="100" w:type="dxa"/>
@@ -1863,7 +2455,7 @@
         </w:tc>
         <w:tc>
           <w:tcPr>
-            <w:tcW w:w="1180" w:type="dxa"/>
+            <w:tcW w:w="1170" w:type="dxa"/>
             <w:tcMar>
               <w:top w:w="100" w:type="dxa"/>
               <w:left w:w="100" w:type="dxa"/>
@@ -1892,7 +2484,7 @@
         </w:tc>
         <w:tc>
           <w:tcPr>
-            <w:tcW w:w="1540" w:type="dxa"/>
+            <w:tcW w:w="1300" w:type="dxa"/>
             <w:tcMar>
               <w:top w:w="100" w:type="dxa"/>
               <w:left w:w="100" w:type="dxa"/>
@@ -1919,7 +2511,7 @@
         </w:trPr>
         <w:tc>
           <w:tcPr>
-            <w:tcW w:w="1480" w:type="dxa"/>
+            <w:tcW w:w="1520" w:type="dxa"/>
             <w:tcMar>
               <w:top w:w="100" w:type="dxa"/>
               <w:left w:w="100" w:type="dxa"/>
@@ -1951,18 +2543,20 @@
         </w:tc>
         <w:tc>
           <w:tcPr>
-            <w:tcW w:w="3135" w:type="dxa"/>
-            <w:tcMar>
-              <w:top w:w="100" w:type="dxa"/>
-              <w:left w:w="100" w:type="dxa"/>
-              <w:bottom w:w="100" w:type="dxa"/>
-              <w:right w:w="100" w:type="dxa"/>
-            </w:tcMar>
-          </w:tcPr>
-          <w:p>
-            <w:pPr>
-              <w:widowControl w:val="0"/>
-              <w:spacing w:after="0" w:line="240" w:lineRule="auto"/>
+            <w:tcW w:w="3150" w:type="dxa"/>
+            <w:tcMar>
+              <w:top w:w="100" w:type="dxa"/>
+              <w:left w:w="100" w:type="dxa"/>
+              <w:bottom w:w="100" w:type="dxa"/>
+              <w:right w:w="100" w:type="dxa"/>
+            </w:tcMar>
+            <w:vAlign w:val="center"/>
+          </w:tcPr>
+          <w:p>
+            <w:pPr>
+              <w:widowControl w:val="0"/>
+              <w:spacing w:after="0" w:line="240" w:lineRule="auto"/>
+              <w:jc w:val="center"/>
               <w:rPr>
                 <w:sz w:val="18"/>
                 <w:szCs w:val="18"/>
@@ -1973,13 +2567,13 @@
                 <w:sz w:val="18"/>
                 <w:szCs w:val="18"/>
               </w:rPr>
-              <w:t>Code should include only letters</w:t>
-            </w:r>
-          </w:p>
-        </w:tc>
-        <w:tc>
-          <w:tcPr>
-            <w:tcW w:w="3225" w:type="dxa"/>
+              <w:t>Code should include only 2 letters</w:t>
+            </w:r>
+          </w:p>
+        </w:tc>
+        <w:tc>
+          <w:tcPr>
+            <w:tcW w:w="3420" w:type="dxa"/>
             <w:tcMar>
               <w:top w:w="100" w:type="dxa"/>
               <w:left w:w="100" w:type="dxa"/>
@@ -2001,7 +2595,7 @@
         </w:tc>
         <w:tc>
           <w:tcPr>
-            <w:tcW w:w="1180" w:type="dxa"/>
+            <w:tcW w:w="1170" w:type="dxa"/>
             <w:tcMar>
               <w:top w:w="100" w:type="dxa"/>
               <w:left w:w="100" w:type="dxa"/>
@@ -2030,7 +2624,7 @@
         </w:tc>
         <w:tc>
           <w:tcPr>
-            <w:tcW w:w="1540" w:type="dxa"/>
+            <w:tcW w:w="1300" w:type="dxa"/>
             <w:tcMar>
               <w:top w:w="100" w:type="dxa"/>
               <w:left w:w="100" w:type="dxa"/>
@@ -2057,7 +2651,7 @@
         </w:trPr>
         <w:tc>
           <w:tcPr>
-            <w:tcW w:w="1480" w:type="dxa"/>
+            <w:tcW w:w="1520" w:type="dxa"/>
             <w:tcMar>
               <w:top w:w="100" w:type="dxa"/>
               <w:left w:w="100" w:type="dxa"/>
@@ -2089,18 +2683,20 @@
         </w:tc>
         <w:tc>
           <w:tcPr>
-            <w:tcW w:w="3135" w:type="dxa"/>
-            <w:tcMar>
-              <w:top w:w="100" w:type="dxa"/>
-              <w:left w:w="100" w:type="dxa"/>
-              <w:bottom w:w="100" w:type="dxa"/>
-              <w:right w:w="100" w:type="dxa"/>
-            </w:tcMar>
-          </w:tcPr>
-          <w:p>
-            <w:pPr>
-              <w:widowControl w:val="0"/>
-              <w:spacing w:after="0" w:line="240" w:lineRule="auto"/>
+            <w:tcW w:w="3150" w:type="dxa"/>
+            <w:tcMar>
+              <w:top w:w="100" w:type="dxa"/>
+              <w:left w:w="100" w:type="dxa"/>
+              <w:bottom w:w="100" w:type="dxa"/>
+              <w:right w:w="100" w:type="dxa"/>
+            </w:tcMar>
+            <w:vAlign w:val="center"/>
+          </w:tcPr>
+          <w:p>
+            <w:pPr>
+              <w:widowControl w:val="0"/>
+              <w:spacing w:after="0" w:line="240" w:lineRule="auto"/>
+              <w:jc w:val="center"/>
               <w:rPr>
                 <w:sz w:val="18"/>
                 <w:szCs w:val="18"/>
@@ -2117,7 +2713,7 @@
         </w:tc>
         <w:tc>
           <w:tcPr>
-            <w:tcW w:w="3225" w:type="dxa"/>
+            <w:tcW w:w="3420" w:type="dxa"/>
             <w:tcMar>
               <w:top w:w="100" w:type="dxa"/>
               <w:left w:w="100" w:type="dxa"/>
@@ -2139,7 +2735,7 @@
         </w:tc>
         <w:tc>
           <w:tcPr>
-            <w:tcW w:w="1180" w:type="dxa"/>
+            <w:tcW w:w="1170" w:type="dxa"/>
             <w:tcMar>
               <w:top w:w="100" w:type="dxa"/>
               <w:left w:w="100" w:type="dxa"/>
@@ -2168,7 +2764,7 @@
         </w:tc>
         <w:tc>
           <w:tcPr>
-            <w:tcW w:w="1540" w:type="dxa"/>
+            <w:tcW w:w="1300" w:type="dxa"/>
             <w:tcMar>
               <w:top w:w="100" w:type="dxa"/>
               <w:left w:w="100" w:type="dxa"/>
@@ -2195,7 +2791,7 @@
         </w:trPr>
         <w:tc>
           <w:tcPr>
-            <w:tcW w:w="1480" w:type="dxa"/>
+            <w:tcW w:w="1520" w:type="dxa"/>
             <w:tcMar>
               <w:top w:w="100" w:type="dxa"/>
               <w:left w:w="100" w:type="dxa"/>
@@ -2227,18 +2823,20 @@
         </w:tc>
         <w:tc>
           <w:tcPr>
-            <w:tcW w:w="3135" w:type="dxa"/>
-            <w:tcMar>
-              <w:top w:w="100" w:type="dxa"/>
-              <w:left w:w="100" w:type="dxa"/>
-              <w:bottom w:w="100" w:type="dxa"/>
-              <w:right w:w="100" w:type="dxa"/>
-            </w:tcMar>
-          </w:tcPr>
-          <w:p>
-            <w:pPr>
-              <w:widowControl w:val="0"/>
-              <w:spacing w:after="0" w:line="240" w:lineRule="auto"/>
+            <w:tcW w:w="3150" w:type="dxa"/>
+            <w:tcMar>
+              <w:top w:w="100" w:type="dxa"/>
+              <w:left w:w="100" w:type="dxa"/>
+              <w:bottom w:w="100" w:type="dxa"/>
+              <w:right w:w="100" w:type="dxa"/>
+            </w:tcMar>
+            <w:vAlign w:val="center"/>
+          </w:tcPr>
+          <w:p>
+            <w:pPr>
+              <w:widowControl w:val="0"/>
+              <w:spacing w:after="0" w:line="240" w:lineRule="auto"/>
+              <w:jc w:val="center"/>
               <w:rPr>
                 <w:sz w:val="18"/>
                 <w:szCs w:val="18"/>
@@ -2255,7 +2853,7 @@
         </w:tc>
         <w:tc>
           <w:tcPr>
-            <w:tcW w:w="3225" w:type="dxa"/>
+            <w:tcW w:w="3420" w:type="dxa"/>
             <w:tcMar>
               <w:top w:w="100" w:type="dxa"/>
               <w:left w:w="100" w:type="dxa"/>
@@ -2277,7 +2875,7 @@
         </w:tc>
         <w:tc>
           <w:tcPr>
-            <w:tcW w:w="1180" w:type="dxa"/>
+            <w:tcW w:w="1170" w:type="dxa"/>
             <w:tcMar>
               <w:top w:w="100" w:type="dxa"/>
               <w:left w:w="100" w:type="dxa"/>
@@ -2306,7 +2904,7 @@
         </w:tc>
         <w:tc>
           <w:tcPr>
-            <w:tcW w:w="1540" w:type="dxa"/>
+            <w:tcW w:w="1300" w:type="dxa"/>
             <w:tcMar>
               <w:top w:w="100" w:type="dxa"/>
               <w:left w:w="100" w:type="dxa"/>
@@ -2333,7 +2931,7 @@
         </w:trPr>
         <w:tc>
           <w:tcPr>
-            <w:tcW w:w="1480" w:type="dxa"/>
+            <w:tcW w:w="1520" w:type="dxa"/>
             <w:tcMar>
               <w:top w:w="100" w:type="dxa"/>
               <w:left w:w="100" w:type="dxa"/>
@@ -2364,18 +2962,20 @@
         </w:tc>
         <w:tc>
           <w:tcPr>
-            <w:tcW w:w="3135" w:type="dxa"/>
-            <w:tcMar>
-              <w:top w:w="100" w:type="dxa"/>
-              <w:left w:w="100" w:type="dxa"/>
-              <w:bottom w:w="100" w:type="dxa"/>
-              <w:right w:w="100" w:type="dxa"/>
-            </w:tcMar>
-          </w:tcPr>
-          <w:p>
-            <w:pPr>
-              <w:widowControl w:val="0"/>
-              <w:spacing w:after="0" w:line="240" w:lineRule="auto"/>
+            <w:tcW w:w="3150" w:type="dxa"/>
+            <w:tcMar>
+              <w:top w:w="100" w:type="dxa"/>
+              <w:left w:w="100" w:type="dxa"/>
+              <w:bottom w:w="100" w:type="dxa"/>
+              <w:right w:w="100" w:type="dxa"/>
+            </w:tcMar>
+            <w:vAlign w:val="center"/>
+          </w:tcPr>
+          <w:p>
+            <w:pPr>
+              <w:widowControl w:val="0"/>
+              <w:spacing w:after="0" w:line="240" w:lineRule="auto"/>
+              <w:jc w:val="center"/>
               <w:rPr>
                 <w:sz w:val="18"/>
                 <w:szCs w:val="18"/>
@@ -2392,7 +2992,7 @@
         </w:tc>
         <w:tc>
           <w:tcPr>
-            <w:tcW w:w="3225" w:type="dxa"/>
+            <w:tcW w:w="3420" w:type="dxa"/>
             <w:tcMar>
               <w:top w:w="100" w:type="dxa"/>
               <w:left w:w="100" w:type="dxa"/>
@@ -2414,7 +3014,7 @@
         </w:tc>
         <w:tc>
           <w:tcPr>
-            <w:tcW w:w="1180" w:type="dxa"/>
+            <w:tcW w:w="1170" w:type="dxa"/>
             <w:tcMar>
               <w:top w:w="100" w:type="dxa"/>
               <w:left w:w="100" w:type="dxa"/>
@@ -2437,13 +3037,13 @@
                 <w:sz w:val="16"/>
                 <w:szCs w:val="16"/>
               </w:rPr>
-              <w:t>Technical</w:t>
-            </w:r>
-          </w:p>
-        </w:tc>
-        <w:tc>
-          <w:tcPr>
-            <w:tcW w:w="1540" w:type="dxa"/>
+              <w:t>Consistency</w:t>
+            </w:r>
+          </w:p>
+        </w:tc>
+        <w:tc>
+          <w:tcPr>
+            <w:tcW w:w="1300" w:type="dxa"/>
             <w:tcMar>
               <w:top w:w="100" w:type="dxa"/>
               <w:left w:w="100" w:type="dxa"/>
@@ -2470,7 +3070,7 @@
         </w:trPr>
         <w:tc>
           <w:tcPr>
-            <w:tcW w:w="1480" w:type="dxa"/>
+            <w:tcW w:w="1520" w:type="dxa"/>
             <w:tcMar>
               <w:top w:w="100" w:type="dxa"/>
               <w:left w:w="100" w:type="dxa"/>
@@ -2496,24 +3096,26 @@
                 <w:sz w:val="20"/>
                 <w:szCs w:val="20"/>
               </w:rPr>
-              <w:t>coordinate Uncertainty</w:t>
-            </w:r>
-          </w:p>
-        </w:tc>
-        <w:tc>
-          <w:tcPr>
-            <w:tcW w:w="3135" w:type="dxa"/>
-            <w:tcMar>
-              <w:top w:w="100" w:type="dxa"/>
-              <w:left w:w="100" w:type="dxa"/>
-              <w:bottom w:w="100" w:type="dxa"/>
-              <w:right w:w="100" w:type="dxa"/>
-            </w:tcMar>
-          </w:tcPr>
-          <w:p>
-            <w:pPr>
-              <w:widowControl w:val="0"/>
-              <w:spacing w:after="0" w:line="240" w:lineRule="auto"/>
+              <w:t>measurementValue</w:t>
+            </w:r>
+          </w:p>
+        </w:tc>
+        <w:tc>
+          <w:tcPr>
+            <w:tcW w:w="3150" w:type="dxa"/>
+            <w:tcMar>
+              <w:top w:w="100" w:type="dxa"/>
+              <w:left w:w="100" w:type="dxa"/>
+              <w:bottom w:w="100" w:type="dxa"/>
+              <w:right w:w="100" w:type="dxa"/>
+            </w:tcMar>
+            <w:vAlign w:val="center"/>
+          </w:tcPr>
+          <w:p>
+            <w:pPr>
+              <w:widowControl w:val="0"/>
+              <w:spacing w:after="0" w:line="240" w:lineRule="auto"/>
+              <w:jc w:val="center"/>
               <w:rPr>
                 <w:sz w:val="18"/>
                 <w:szCs w:val="18"/>
@@ -2524,13 +3126,13 @@
                 <w:sz w:val="18"/>
                 <w:szCs w:val="18"/>
               </w:rPr>
-              <w:t>Uncertainty in meters</w:t>
-            </w:r>
-          </w:p>
-        </w:tc>
-        <w:tc>
-          <w:tcPr>
-            <w:tcW w:w="3225" w:type="dxa"/>
+              <w:t>Air temperature should be in Celsius</w:t>
+            </w:r>
+          </w:p>
+        </w:tc>
+        <w:tc>
+          <w:tcPr>
+            <w:tcW w:w="3420" w:type="dxa"/>
             <w:tcMar>
               <w:top w:w="100" w:type="dxa"/>
               <w:left w:w="100" w:type="dxa"/>
@@ -2552,7 +3154,7 @@
         </w:tc>
         <w:tc>
           <w:tcPr>
-            <w:tcW w:w="1180" w:type="dxa"/>
+            <w:tcW w:w="1170" w:type="dxa"/>
             <w:tcMar>
               <w:top w:w="100" w:type="dxa"/>
               <w:left w:w="100" w:type="dxa"/>
@@ -2581,7 +3183,7 @@
         </w:tc>
         <w:tc>
           <w:tcPr>
-            <w:tcW w:w="1540" w:type="dxa"/>
+            <w:tcW w:w="1300" w:type="dxa"/>
             <w:tcMar>
               <w:top w:w="100" w:type="dxa"/>
               <w:left w:w="100" w:type="dxa"/>
@@ -2711,11 +3313,6 @@
     </w:tbl>
     <w:p>
       <w:pPr>
-        <w:spacing w:before="120" w:line="240" w:lineRule="auto"/>
-      </w:pPr>
-    </w:p>
-    <w:p>
-      <w:pPr>
         <w:rPr>
           <w:rFonts w:ascii="Arial Narrow" w:eastAsia="Arial Narrow" w:hAnsi="Arial Narrow" w:cs="Arial Narrow"/>
           <w:b/>
@@ -2725,16 +3322,12 @@
       </w:pPr>
       <w:bookmarkStart w:id="4" w:name="_ko0afqp6iknk" w:colFirst="0" w:colLast="0"/>
       <w:bookmarkEnd w:id="4"/>
-      <w:r>
-        <w:br w:type="page"/>
-      </w:r>
     </w:p>
     <w:p>
       <w:pPr>
         <w:pStyle w:val="Heading2"/>
       </w:pPr>
       <w:r>
-        <w:lastRenderedPageBreak/>
         <w:t>2b. Data validation check: other data management tools</w:t>
       </w:r>
     </w:p>
@@ -2926,6 +3519,14 @@
               </w:rPr>
               <w:t>Type</w:t>
             </w:r>
+            <w:r>
+              <w:rPr>
+                <w:b/>
+                <w:sz w:val="18"/>
+                <w:szCs w:val="18"/>
+              </w:rPr>
+              <w:t>/subtype</w:t>
+            </w:r>
           </w:p>
         </w:tc>
         <w:tc>
@@ -2993,42 +3594,34 @@
                 <w:sz w:val="18"/>
                 <w:szCs w:val="18"/>
               </w:rPr>
-              <w:t>scientificName</w:t>
-            </w:r>
-            <w:r>
-              <w:rPr>
-                <w:b/>
+              <w:t xml:space="preserve">scientificName </w:t>
+            </w:r>
+          </w:p>
+        </w:tc>
+        <w:tc>
+          <w:tcPr>
+            <w:tcW w:w="1895" w:type="dxa"/>
+            <w:tcMar>
+              <w:top w:w="100" w:type="dxa"/>
+              <w:left w:w="100" w:type="dxa"/>
+              <w:bottom w:w="100" w:type="dxa"/>
+              <w:right w:w="100" w:type="dxa"/>
+            </w:tcMar>
+          </w:tcPr>
+          <w:p>
+            <w:pPr>
+              <w:widowControl w:val="0"/>
+              <w:spacing w:after="0" w:line="240" w:lineRule="auto"/>
+              <w:rPr>
                 <w:sz w:val="18"/>
                 <w:szCs w:val="18"/>
               </w:rPr>
-              <w:t xml:space="preserve"> </w:t>
-            </w:r>
-          </w:p>
-        </w:tc>
-        <w:tc>
-          <w:tcPr>
-            <w:tcW w:w="1895" w:type="dxa"/>
-            <w:tcMar>
-              <w:top w:w="100" w:type="dxa"/>
-              <w:left w:w="100" w:type="dxa"/>
-              <w:bottom w:w="100" w:type="dxa"/>
-              <w:right w:w="100" w:type="dxa"/>
-            </w:tcMar>
-          </w:tcPr>
-          <w:p>
-            <w:pPr>
-              <w:widowControl w:val="0"/>
-              <w:spacing w:after="0" w:line="240" w:lineRule="auto"/>
+            </w:pPr>
+            <w:r>
               <w:rPr>
                 <w:sz w:val="18"/>
                 <w:szCs w:val="18"/>
               </w:rPr>
-            </w:pPr>
-            <w:r>
-              <w:rPr>
-                <w:sz w:val="18"/>
-                <w:szCs w:val="18"/>
-              </w:rPr>
               <w:t>Are the names valid?</w:t>
             </w:r>
           </w:p>
@@ -3075,13 +3668,6 @@
                 <w:szCs w:val="16"/>
               </w:rPr>
             </w:pPr>
-            <w:r>
-              <w:rPr>
-                <w:sz w:val="16"/>
-                <w:szCs w:val="16"/>
-              </w:rPr>
-              <w:t>Nomenclatural</w:t>
-            </w:r>
           </w:p>
         </w:tc>
         <w:tc>
@@ -3253,13 +3839,6 @@
                 <w:szCs w:val="16"/>
               </w:rPr>
             </w:pPr>
-            <w:r>
-              <w:rPr>
-                <w:sz w:val="16"/>
-                <w:szCs w:val="16"/>
-              </w:rPr>
-              <w:t>Format</w:t>
-            </w:r>
           </w:p>
         </w:tc>
         <w:tc>
@@ -3425,13 +4004,6 @@
                 <w:szCs w:val="16"/>
               </w:rPr>
             </w:pPr>
-            <w:r>
-              <w:rPr>
-                <w:sz w:val="16"/>
-                <w:szCs w:val="16"/>
-              </w:rPr>
-              <w:t>Geographic</w:t>
-            </w:r>
           </w:p>
         </w:tc>
         <w:tc>
@@ -3564,13 +4136,6 @@
                 <w:szCs w:val="16"/>
               </w:rPr>
             </w:pPr>
-            <w:r>
-              <w:rPr>
-                <w:sz w:val="16"/>
-                <w:szCs w:val="16"/>
-              </w:rPr>
-              <w:t>Format</w:t>
-            </w:r>
           </w:p>
         </w:tc>
         <w:tc>
@@ -3970,12 +4535,12 @@
       </w:pPr>
     </w:p>
     <w:sectPr>
-      <w:headerReference w:type="even" r:id="rId6"/>
-      <w:headerReference w:type="default" r:id="rId7"/>
-      <w:footerReference w:type="even" r:id="rId8"/>
-      <w:footerReference w:type="default" r:id="rId9"/>
-      <w:headerReference w:type="first" r:id="rId10"/>
-      <w:footerReference w:type="first" r:id="rId11"/>
+      <w:headerReference w:type="even" r:id="rId7"/>
+      <w:headerReference w:type="default" r:id="rId8"/>
+      <w:footerReference w:type="even" r:id="rId9"/>
+      <w:footerReference w:type="default" r:id="rId10"/>
+      <w:headerReference w:type="first" r:id="rId11"/>
+      <w:footerReference w:type="first" r:id="rId12"/>
       <w:pgSz w:w="11894" w:h="16819"/>
       <w:pgMar w:top="1800" w:right="360" w:bottom="792" w:left="720" w:header="0" w:footer="720" w:gutter="0"/>
       <w:pgNumType w:start="1"/>
@@ -4416,6 +4981,15 @@
     <w:r>
       <w:rPr>
         <w:i/>
+        <w:noProof/>
+        <w:sz w:val="18"/>
+        <w:szCs w:val="18"/>
+      </w:rPr>
+      <w:t>5</w:t>
+    </w:r>
+    <w:r>
+      <w:rPr>
+        <w:i/>
         <w:sz w:val="18"/>
         <w:szCs w:val="18"/>
       </w:rPr>
@@ -4644,6 +5218,315 @@
     </w:r>
   </w:p>
 </w:hdr>
+</file>
+
+<file path=word/numbering.xml><?xml version="1.0" encoding="utf-8"?>
+<w:numbering xmlns:wpc="http://schemas.microsoft.com/office/word/2010/wordprocessingCanvas" xmlns:cx="http://schemas.microsoft.com/office/drawing/2014/chartex" xmlns:cx1="http://schemas.microsoft.com/office/drawing/2015/9/8/chartex" xmlns:cx2="http://schemas.microsoft.com/office/drawing/2015/10/21/chartex" xmlns:cx3="http://schemas.microsoft.com/office/drawing/2016/5/9/chartex" xmlns:cx4="http://schemas.microsoft.com/office/drawing/2016/5/10/chartex" xmlns:cx5="http://schemas.microsoft.com/office/drawing/2016/5/11/chartex" xmlns:cx6="http://schemas.microsoft.com/office/drawing/2016/5/12/chartex" xmlns:cx7="http://schemas.microsoft.com/office/drawing/2016/5/13/chartex" xmlns:cx8="http://schemas.microsoft.com/office/drawing/2016/5/14/chartex" xmlns:mc="http://schemas.openxmlformats.org/markup-compatibility/2006" xmlns:aink="http://schemas.microsoft.com/office/drawing/2016/ink" xmlns:am3d="http://schemas.microsoft.com/office/drawing/2017/model3d" xmlns:o="urn:schemas-microsoft-com:office:office" xmlns:oel="http://schemas.microsoft.com/office/2019/extlst" xmlns:r="http://schemas.openxmlformats.org/officeDocument/2006/relationships" xmlns:m="http://schemas.openxmlformats.org/officeDocument/2006/math" xmlns:v="urn:schemas-microsoft-com:vml" xmlns:wp14="http://schemas.microsoft.com/office/word/2010/wordprocessingDrawing" xmlns:wp="http://schemas.openxmlformats.org/drawingml/2006/wordprocessingDrawing" xmlns:w10="urn:schemas-microsoft-com:office:word" xmlns:w="http://schemas.openxmlformats.org/wordprocessingml/2006/main" xmlns:w14="http://schemas.microsoft.com/office/word/2010/wordml" xmlns:w15="http://schemas.microsoft.com/office/word/2012/wordml" xmlns:w16cex="http://schemas.microsoft.com/office/word/2018/wordml/cex" xmlns:w16cid="http://schemas.microsoft.com/office/word/2016/wordml/cid" xmlns:w16="http://schemas.microsoft.com/office/word/2018/wordml" xmlns:w16du="http://schemas.microsoft.com/office/word/2023/wordml/word16du" xmlns:w16sdtdh="http://schemas.microsoft.com/office/word/2020/wordml/sdtdatahash" xmlns:w16sdtfl="http://schemas.microsoft.com/office/word/2024/wordml/sdtformatlock" xmlns:w16se="http://schemas.microsoft.com/office/word/2015/wordml/symex" xmlns:wpg="http://schemas.microsoft.com/office/word/2010/wordprocessingGroup" xmlns:wpi="http://schemas.microsoft.com/office/word/2010/wordprocessingInk" xmlns:wne="http://schemas.microsoft.com/office/word/2006/wordml" xmlns:wps="http://schemas.microsoft.com/office/word/2010/wordprocessingShape" mc:Ignorable="w14 w15 w16se w16cid w16 w16cex w16sdtdh w16sdtfl w16du wp14">
+  <w:abstractNum w:abstractNumId="0" w15:restartNumberingAfterBreak="0">
+    <w:nsid w:val="54C41C18"/>
+    <w:multiLevelType w:val="multilevel"/>
+    <w:tmpl w:val="E7E0184C"/>
+    <w:lvl w:ilvl="0">
+      <w:start w:val="1"/>
+      <w:numFmt w:val="bullet"/>
+      <w:lvlText w:val=""/>
+      <w:lvlJc w:val="left"/>
+      <w:pPr>
+        <w:tabs>
+          <w:tab w:val="num" w:pos="720"/>
+        </w:tabs>
+        <w:ind w:left="720" w:hanging="360"/>
+      </w:pPr>
+      <w:rPr>
+        <w:rFonts w:ascii="Symbol" w:hAnsi="Symbol" w:hint="default"/>
+        <w:sz w:val="20"/>
+      </w:rPr>
+    </w:lvl>
+    <w:lvl w:ilvl="1" w:tentative="1">
+      <w:start w:val="1"/>
+      <w:numFmt w:val="bullet"/>
+      <w:lvlText w:val="o"/>
+      <w:lvlJc w:val="left"/>
+      <w:pPr>
+        <w:tabs>
+          <w:tab w:val="num" w:pos="1440"/>
+        </w:tabs>
+        <w:ind w:left="1440" w:hanging="360"/>
+      </w:pPr>
+      <w:rPr>
+        <w:rFonts w:ascii="Courier New" w:hAnsi="Courier New" w:hint="default"/>
+        <w:sz w:val="20"/>
+      </w:rPr>
+    </w:lvl>
+    <w:lvl w:ilvl="2" w:tentative="1">
+      <w:start w:val="1"/>
+      <w:numFmt w:val="bullet"/>
+      <w:lvlText w:val=""/>
+      <w:lvlJc w:val="left"/>
+      <w:pPr>
+        <w:tabs>
+          <w:tab w:val="num" w:pos="2160"/>
+        </w:tabs>
+        <w:ind w:left="2160" w:hanging="360"/>
+      </w:pPr>
+      <w:rPr>
+        <w:rFonts w:ascii="Wingdings" w:hAnsi="Wingdings" w:hint="default"/>
+        <w:sz w:val="20"/>
+      </w:rPr>
+    </w:lvl>
+    <w:lvl w:ilvl="3" w:tentative="1">
+      <w:start w:val="1"/>
+      <w:numFmt w:val="bullet"/>
+      <w:lvlText w:val=""/>
+      <w:lvlJc w:val="left"/>
+      <w:pPr>
+        <w:tabs>
+          <w:tab w:val="num" w:pos="2880"/>
+        </w:tabs>
+        <w:ind w:left="2880" w:hanging="360"/>
+      </w:pPr>
+      <w:rPr>
+        <w:rFonts w:ascii="Wingdings" w:hAnsi="Wingdings" w:hint="default"/>
+        <w:sz w:val="20"/>
+      </w:rPr>
+    </w:lvl>
+    <w:lvl w:ilvl="4" w:tentative="1">
+      <w:start w:val="1"/>
+      <w:numFmt w:val="bullet"/>
+      <w:lvlText w:val=""/>
+      <w:lvlJc w:val="left"/>
+      <w:pPr>
+        <w:tabs>
+          <w:tab w:val="num" w:pos="3600"/>
+        </w:tabs>
+        <w:ind w:left="3600" w:hanging="360"/>
+      </w:pPr>
+      <w:rPr>
+        <w:rFonts w:ascii="Wingdings" w:hAnsi="Wingdings" w:hint="default"/>
+        <w:sz w:val="20"/>
+      </w:rPr>
+    </w:lvl>
+    <w:lvl w:ilvl="5" w:tentative="1">
+      <w:start w:val="1"/>
+      <w:numFmt w:val="bullet"/>
+      <w:lvlText w:val=""/>
+      <w:lvlJc w:val="left"/>
+      <w:pPr>
+        <w:tabs>
+          <w:tab w:val="num" w:pos="4320"/>
+        </w:tabs>
+        <w:ind w:left="4320" w:hanging="360"/>
+      </w:pPr>
+      <w:rPr>
+        <w:rFonts w:ascii="Wingdings" w:hAnsi="Wingdings" w:hint="default"/>
+        <w:sz w:val="20"/>
+      </w:rPr>
+    </w:lvl>
+    <w:lvl w:ilvl="6" w:tentative="1">
+      <w:start w:val="1"/>
+      <w:numFmt w:val="bullet"/>
+      <w:lvlText w:val=""/>
+      <w:lvlJc w:val="left"/>
+      <w:pPr>
+        <w:tabs>
+          <w:tab w:val="num" w:pos="5040"/>
+        </w:tabs>
+        <w:ind w:left="5040" w:hanging="360"/>
+      </w:pPr>
+      <w:rPr>
+        <w:rFonts w:ascii="Wingdings" w:hAnsi="Wingdings" w:hint="default"/>
+        <w:sz w:val="20"/>
+      </w:rPr>
+    </w:lvl>
+    <w:lvl w:ilvl="7" w:tentative="1">
+      <w:start w:val="1"/>
+      <w:numFmt w:val="bullet"/>
+      <w:lvlText w:val=""/>
+      <w:lvlJc w:val="left"/>
+      <w:pPr>
+        <w:tabs>
+          <w:tab w:val="num" w:pos="5760"/>
+        </w:tabs>
+        <w:ind w:left="5760" w:hanging="360"/>
+      </w:pPr>
+      <w:rPr>
+        <w:rFonts w:ascii="Wingdings" w:hAnsi="Wingdings" w:hint="default"/>
+        <w:sz w:val="20"/>
+      </w:rPr>
+    </w:lvl>
+    <w:lvl w:ilvl="8" w:tentative="1">
+      <w:start w:val="1"/>
+      <w:numFmt w:val="bullet"/>
+      <w:lvlText w:val=""/>
+      <w:lvlJc w:val="left"/>
+      <w:pPr>
+        <w:tabs>
+          <w:tab w:val="num" w:pos="6480"/>
+        </w:tabs>
+        <w:ind w:left="6480" w:hanging="360"/>
+      </w:pPr>
+      <w:rPr>
+        <w:rFonts w:ascii="Wingdings" w:hAnsi="Wingdings" w:hint="default"/>
+        <w:sz w:val="20"/>
+      </w:rPr>
+    </w:lvl>
+  </w:abstractNum>
+  <w:abstractNum w:abstractNumId="1" w15:restartNumberingAfterBreak="0">
+    <w:nsid w:val="6DB177E5"/>
+    <w:multiLevelType w:val="multilevel"/>
+    <w:tmpl w:val="B7943A5E"/>
+    <w:lvl w:ilvl="0">
+      <w:start w:val="1"/>
+      <w:numFmt w:val="bullet"/>
+      <w:lvlText w:val=""/>
+      <w:lvlJc w:val="left"/>
+      <w:pPr>
+        <w:tabs>
+          <w:tab w:val="num" w:pos="720"/>
+        </w:tabs>
+        <w:ind w:left="720" w:hanging="360"/>
+      </w:pPr>
+      <w:rPr>
+        <w:rFonts w:ascii="Symbol" w:hAnsi="Symbol" w:hint="default"/>
+        <w:sz w:val="20"/>
+      </w:rPr>
+    </w:lvl>
+    <w:lvl w:ilvl="1" w:tentative="1">
+      <w:start w:val="1"/>
+      <w:numFmt w:val="bullet"/>
+      <w:lvlText w:val="o"/>
+      <w:lvlJc w:val="left"/>
+      <w:pPr>
+        <w:tabs>
+          <w:tab w:val="num" w:pos="1440"/>
+        </w:tabs>
+        <w:ind w:left="1440" w:hanging="360"/>
+      </w:pPr>
+      <w:rPr>
+        <w:rFonts w:ascii="Courier New" w:hAnsi="Courier New" w:hint="default"/>
+        <w:sz w:val="20"/>
+      </w:rPr>
+    </w:lvl>
+    <w:lvl w:ilvl="2" w:tentative="1">
+      <w:start w:val="1"/>
+      <w:numFmt w:val="bullet"/>
+      <w:lvlText w:val=""/>
+      <w:lvlJc w:val="left"/>
+      <w:pPr>
+        <w:tabs>
+          <w:tab w:val="num" w:pos="2160"/>
+        </w:tabs>
+        <w:ind w:left="2160" w:hanging="360"/>
+      </w:pPr>
+      <w:rPr>
+        <w:rFonts w:ascii="Wingdings" w:hAnsi="Wingdings" w:hint="default"/>
+        <w:sz w:val="20"/>
+      </w:rPr>
+    </w:lvl>
+    <w:lvl w:ilvl="3" w:tentative="1">
+      <w:start w:val="1"/>
+      <w:numFmt w:val="bullet"/>
+      <w:lvlText w:val=""/>
+      <w:lvlJc w:val="left"/>
+      <w:pPr>
+        <w:tabs>
+          <w:tab w:val="num" w:pos="2880"/>
+        </w:tabs>
+        <w:ind w:left="2880" w:hanging="360"/>
+      </w:pPr>
+      <w:rPr>
+        <w:rFonts w:ascii="Wingdings" w:hAnsi="Wingdings" w:hint="default"/>
+        <w:sz w:val="20"/>
+      </w:rPr>
+    </w:lvl>
+    <w:lvl w:ilvl="4" w:tentative="1">
+      <w:start w:val="1"/>
+      <w:numFmt w:val="bullet"/>
+      <w:lvlText w:val=""/>
+      <w:lvlJc w:val="left"/>
+      <w:pPr>
+        <w:tabs>
+          <w:tab w:val="num" w:pos="3600"/>
+        </w:tabs>
+        <w:ind w:left="3600" w:hanging="360"/>
+      </w:pPr>
+      <w:rPr>
+        <w:rFonts w:ascii="Wingdings" w:hAnsi="Wingdings" w:hint="default"/>
+        <w:sz w:val="20"/>
+      </w:rPr>
+    </w:lvl>
+    <w:lvl w:ilvl="5" w:tentative="1">
+      <w:start w:val="1"/>
+      <w:numFmt w:val="bullet"/>
+      <w:lvlText w:val=""/>
+      <w:lvlJc w:val="left"/>
+      <w:pPr>
+        <w:tabs>
+          <w:tab w:val="num" w:pos="4320"/>
+        </w:tabs>
+        <w:ind w:left="4320" w:hanging="360"/>
+      </w:pPr>
+      <w:rPr>
+        <w:rFonts w:ascii="Wingdings" w:hAnsi="Wingdings" w:hint="default"/>
+        <w:sz w:val="20"/>
+      </w:rPr>
+    </w:lvl>
+    <w:lvl w:ilvl="6" w:tentative="1">
+      <w:start w:val="1"/>
+      <w:numFmt w:val="bullet"/>
+      <w:lvlText w:val=""/>
+      <w:lvlJc w:val="left"/>
+      <w:pPr>
+        <w:tabs>
+          <w:tab w:val="num" w:pos="5040"/>
+        </w:tabs>
+        <w:ind w:left="5040" w:hanging="360"/>
+      </w:pPr>
+      <w:rPr>
+        <w:rFonts w:ascii="Wingdings" w:hAnsi="Wingdings" w:hint="default"/>
+        <w:sz w:val="20"/>
+      </w:rPr>
+    </w:lvl>
+    <w:lvl w:ilvl="7" w:tentative="1">
+      <w:start w:val="1"/>
+      <w:numFmt w:val="bullet"/>
+      <w:lvlText w:val=""/>
+      <w:lvlJc w:val="left"/>
+      <w:pPr>
+        <w:tabs>
+          <w:tab w:val="num" w:pos="5760"/>
+        </w:tabs>
+        <w:ind w:left="5760" w:hanging="360"/>
+      </w:pPr>
+      <w:rPr>
+        <w:rFonts w:ascii="Wingdings" w:hAnsi="Wingdings" w:hint="default"/>
+        <w:sz w:val="20"/>
+      </w:rPr>
+    </w:lvl>
+    <w:lvl w:ilvl="8" w:tentative="1">
+      <w:start w:val="1"/>
+      <w:numFmt w:val="bullet"/>
+      <w:lvlText w:val=""/>
+      <w:lvlJc w:val="left"/>
+      <w:pPr>
+        <w:tabs>
+          <w:tab w:val="num" w:pos="6480"/>
+        </w:tabs>
+        <w:ind w:left="6480" w:hanging="360"/>
+      </w:pPr>
+      <w:rPr>
+        <w:rFonts w:ascii="Wingdings" w:hAnsi="Wingdings" w:hint="default"/>
+        <w:sz w:val="20"/>
+      </w:rPr>
+    </w:lvl>
+  </w:abstractNum>
+  <w:num w:numId="1" w16cid:durableId="1412119154">
+    <w:abstractNumId w:val="1"/>
+  </w:num>
+  <w:num w:numId="2" w16cid:durableId="771360536">
+    <w:abstractNumId w:val="0"/>
+  </w:num>
+</w:numbering>
 </file>
 
 <file path=word/styles.xml><?xml version="1.0" encoding="utf-8"?>
@@ -6435,6 +7318,33 @@
       </w:tblBorders>
     </w:tblPr>
   </w:style>
+  <w:style w:type="paragraph" w:styleId="NormalWeb">
+    <w:name w:val="Normal (Web)"/>
+    <w:basedOn w:val="Normal"/>
+    <w:uiPriority w:val="99"/>
+    <w:unhideWhenUsed/>
+    <w:rsid w:val="00D4081B"/>
+    <w:pPr>
+      <w:spacing w:before="100" w:beforeAutospacing="1" w:after="100" w:afterAutospacing="1" w:line="240" w:lineRule="auto"/>
+    </w:pPr>
+    <w:rPr>
+      <w:rFonts w:ascii="Times New Roman" w:eastAsia="Times New Roman" w:hAnsi="Times New Roman" w:cs="Times New Roman"/>
+      <w:sz w:val="24"/>
+      <w:szCs w:val="24"/>
+      <w:lang w:val="en-US"/>
+    </w:rPr>
+  </w:style>
+  <w:style w:type="character" w:styleId="Strong">
+    <w:name w:val="Strong"/>
+    <w:basedOn w:val="DefaultParagraphFont"/>
+    <w:uiPriority w:val="22"/>
+    <w:qFormat/>
+    <w:rsid w:val="00D4081B"/>
+    <w:rPr>
+      <w:b/>
+      <w:bCs/>
+    </w:rPr>
+  </w:style>
 </w:styles>
 </file>
 

</xml_diff>

<commit_message>
Edits post BIDLAC workshop
</commit_message>
<xml_diff>
--- a/en/data-mobilization/modules/ROOT/attachments/UC-Practice-exercise-sheet_EN.docx
+++ b/en/data-mobilization/modules/ROOT/attachments/UC-Practice-exercise-sheet_EN.docx
@@ -61,6 +61,95 @@
         </w:rPr>
         <w:t>1a. Darwin Core terms</w:t>
       </w:r>
+      <w:r>
+        <w:rPr>
+          <w:b/>
+          <w:bCs/>
+        </w:rPr>
+        <w:t xml:space="preserve"> - </w:t>
+      </w:r>
+      <w:r>
+        <w:rPr>
+          <w:b/>
+          <w:bCs/>
+        </w:rPr>
+        <w:fldChar w:fldCharType="begin"/>
+      </w:r>
+      <w:r>
+        <w:rPr>
+          <w:b/>
+          <w:bCs/>
+        </w:rPr>
+        <w:instrText>HYPERLINK "</w:instrText>
+      </w:r>
+      <w:r>
+        <w:rPr>
+          <w:b/>
+          <w:bCs/>
+        </w:rPr>
+        <w:instrText>https://training.gbif.org/en/data-mobilization/capture#exercise-1a</w:instrText>
+      </w:r>
+      <w:r>
+        <w:rPr>
+          <w:b/>
+          <w:bCs/>
+        </w:rPr>
+        <w:instrText>"</w:instrText>
+      </w:r>
+      <w:r>
+        <w:rPr>
+          <w:b/>
+          <w:bCs/>
+        </w:rPr>
+        <w:fldChar w:fldCharType="separate"/>
+      </w:r>
+      <w:r>
+        <w:rPr>
+          <w:rStyle w:val="Hyperlink"/>
+          <w:b/>
+          <w:bCs/>
+        </w:rPr>
+        <w:t>https://training.gbif.org/en/data-mobilization/capture#exercise-1a</w:t>
+      </w:r>
+      <w:r>
+        <w:rPr>
+          <w:b/>
+          <w:bCs/>
+        </w:rPr>
+        <w:fldChar w:fldCharType="end"/>
+      </w:r>
+      <w:r>
+        <w:rPr>
+          <w:b/>
+          <w:bCs/>
+        </w:rPr>
+        <w:t xml:space="preserve">  </w:t>
+      </w:r>
+      <w:hyperlink r:id="rId7" w:history="1">
+        <w:r>
+          <w:rPr>
+            <w:rStyle w:val="Hyperlink"/>
+            <w:b/>
+            <w:bCs/>
+          </w:rPr>
+          <w:t>https://dwc.tdwg.org/terms/</w:t>
+        </w:r>
+      </w:hyperlink>
+      <w:r>
+        <w:rPr>
+          <w:b/>
+          <w:bCs/>
+        </w:rPr>
+        <w:t xml:space="preserve"> </w:t>
+      </w:r>
+    </w:p>
+    <w:p>
+      <w:pPr>
+        <w:rPr>
+          <w:b/>
+          <w:bCs/>
+        </w:rPr>
+      </w:pPr>
     </w:p>
     <w:tbl>
       <w:tblPr>
@@ -827,6 +916,38 @@
         <w:lastRenderedPageBreak/>
         <w:t>1b. Dataset type discussion</w:t>
       </w:r>
+      <w:r>
+        <w:rPr>
+          <w:b/>
+          <w:bCs/>
+        </w:rPr>
+        <w:t xml:space="preserve"> - </w:t>
+      </w:r>
+      <w:hyperlink r:id="rId8" w:history="1">
+        <w:r>
+          <w:rPr>
+            <w:rStyle w:val="Hyperlink"/>
+            <w:b/>
+            <w:bCs/>
+          </w:rPr>
+          <w:t>https://training.gbif.org/en/data-mobilization/capture#exercise-1b</w:t>
+        </w:r>
+      </w:hyperlink>
+      <w:r>
+        <w:rPr>
+          <w:b/>
+          <w:bCs/>
+        </w:rPr>
+        <w:t xml:space="preserve"> </w:t>
+      </w:r>
+    </w:p>
+    <w:p>
+      <w:pPr>
+        <w:rPr>
+          <w:b/>
+          <w:bCs/>
+        </w:rPr>
+      </w:pPr>
     </w:p>
     <w:tbl>
       <w:tblPr>
@@ -1078,6 +1199,38 @@
         </w:rPr>
         <w:t>1c. Data capture from log files</w:t>
       </w:r>
+      <w:r>
+        <w:rPr>
+          <w:b/>
+          <w:bCs/>
+        </w:rPr>
+        <w:t xml:space="preserve"> – </w:t>
+      </w:r>
+      <w:hyperlink r:id="rId9" w:history="1">
+        <w:r>
+          <w:rPr>
+            <w:rStyle w:val="Hyperlink"/>
+            <w:b/>
+            <w:bCs/>
+          </w:rPr>
+          <w:t>https://training.gbif.org/en/data-mobilization/capture#exercise-1c</w:t>
+        </w:r>
+      </w:hyperlink>
+      <w:r>
+        <w:rPr>
+          <w:b/>
+          <w:bCs/>
+        </w:rPr>
+        <w:t xml:space="preserve">  </w:t>
+      </w:r>
+    </w:p>
+    <w:p>
+      <w:pPr>
+        <w:rPr>
+          <w:b/>
+          <w:bCs/>
+        </w:rPr>
+      </w:pPr>
     </w:p>
     <w:tbl>
       <w:tblPr>
@@ -1344,22 +1497,14 @@
     </w:tbl>
     <w:p>
       <w:pPr>
-        <w:pStyle w:val="Heading1"/>
+        <w:rPr>
+          <w:b/>
+          <w:sz w:val="28"/>
+          <w:szCs w:val="28"/>
+        </w:rPr>
       </w:pPr>
       <w:bookmarkStart w:id="1" w:name="_p20cyp96hzh" w:colFirst="0" w:colLast="0"/>
       <w:bookmarkEnd w:id="1"/>
-    </w:p>
-    <w:p>
-      <w:pPr>
-        <w:rPr>
-          <w:b/>
-          <w:sz w:val="28"/>
-          <w:szCs w:val="28"/>
-        </w:rPr>
-      </w:pPr>
-      <w:r>
-        <w:br w:type="page"/>
-      </w:r>
     </w:p>
     <w:p>
       <w:pPr>
@@ -1396,7 +1541,21 @@
       <w:bookmarkStart w:id="2" w:name="_gsjyu2p8f31r" w:colFirst="0" w:colLast="0"/>
       <w:bookmarkEnd w:id="2"/>
       <w:r>
-        <w:t>2a: Data validation check: data cleaning</w:t>
+        <w:t xml:space="preserve">2a: Data validation check: </w:t>
+      </w:r>
+      <w:r>
+        <w:t xml:space="preserve">- </w:t>
+      </w:r>
+      <w:hyperlink r:id="rId10" w:history="1">
+        <w:r>
+          <w:rPr>
+            <w:rStyle w:val="Hyperlink"/>
+          </w:rPr>
+          <w:t>https://training.gbif.org/en/data-mobilization/management#exercise-2a</w:t>
+        </w:r>
+      </w:hyperlink>
+      <w:r>
+        <w:t xml:space="preserve"> </w:t>
       </w:r>
     </w:p>
     <w:p>
@@ -1520,25 +1679,7 @@
           <w:sz w:val="20"/>
           <w:szCs w:val="20"/>
         </w:rPr>
-        <w:t xml:space="preserve">: Whether all the data and metadata </w:t>
-      </w:r>
-      <w:r>
-        <w:rPr>
-          <w:rFonts w:ascii="Arial" w:hAnsi="Arial" w:cs="Arial"/>
-          <w:color w:val="333333"/>
-          <w:sz w:val="20"/>
-          <w:szCs w:val="20"/>
-        </w:rPr>
-        <w:t>are</w:t>
-      </w:r>
-      <w:r>
-        <w:rPr>
-          <w:rFonts w:ascii="Arial" w:hAnsi="Arial" w:cs="Arial"/>
-          <w:color w:val="333333"/>
-          <w:sz w:val="20"/>
-          <w:szCs w:val="20"/>
-        </w:rPr>
-        <w:t xml:space="preserve"> available – are all fields present, are all fields filled out?</w:t>
+        <w:t>: Whether all the data and metadata are available – are all fields present, are all fields filled out?</w:t>
       </w:r>
     </w:p>
     <w:p>
@@ -3328,9 +3469,24 @@
         <w:pStyle w:val="Heading2"/>
       </w:pPr>
       <w:r>
-        <w:t>2b. Data validation check: other data management tools</w:t>
+        <w:t>2b. Data validation check</w:t>
+      </w:r>
+      <w:r>
+        <w:t xml:space="preserve"> and cleaning - </w:t>
+      </w:r>
+      <w:hyperlink r:id="rId11" w:history="1">
+        <w:r>
+          <w:rPr>
+            <w:rStyle w:val="Hyperlink"/>
+          </w:rPr>
+          <w:t>https://training.gbif.org/en/data-mobilization/management#exercise-2b</w:t>
+        </w:r>
+      </w:hyperlink>
+      <w:r>
+        <w:t xml:space="preserve"> </w:t>
       </w:r>
     </w:p>
+    <w:p/>
     <w:tbl>
       <w:tblPr>
         <w:tblStyle w:val="a4"/>
@@ -4183,7 +4339,22 @@
       <w:r>
         <w:t>2c. OpenRefine</w:t>
       </w:r>
+      <w:r>
+        <w:t xml:space="preserve"> - </w:t>
+      </w:r>
+      <w:hyperlink r:id="rId12" w:history="1">
+        <w:r>
+          <w:rPr>
+            <w:rStyle w:val="Hyperlink"/>
+          </w:rPr>
+          <w:t>https://training.gbif.org/en/data-mobilization/management#exercise-2c</w:t>
+        </w:r>
+      </w:hyperlink>
+      <w:r>
+        <w:t xml:space="preserve"> </w:t>
+      </w:r>
     </w:p>
+    <w:p/>
     <w:tbl>
       <w:tblPr>
         <w:tblStyle w:val="a5"/>
@@ -4319,7 +4490,22 @@
       <w:r>
         <w:t>: Biodiversity Data Publishing</w:t>
       </w:r>
+      <w:r>
+        <w:t xml:space="preserve"> - </w:t>
+      </w:r>
+      <w:hyperlink r:id="rId13" w:history="1">
+        <w:r>
+          <w:rPr>
+            <w:rStyle w:val="Hyperlink"/>
+          </w:rPr>
+          <w:t>https://training.gbif.org/en/data-mobilization/publishing#exercise-3</w:t>
+        </w:r>
+      </w:hyperlink>
+      <w:r>
+        <w:t xml:space="preserve"> </w:t>
+      </w:r>
     </w:p>
+    <w:p/>
     <w:tbl>
       <w:tblPr>
         <w:tblStyle w:val="a6"/>
@@ -4398,6 +4584,9 @@
               <w:widowControl w:val="0"/>
               <w:spacing w:after="0" w:line="240" w:lineRule="auto"/>
             </w:pPr>
+            <w:r>
+              <w:t xml:space="preserve"> </w:t>
+            </w:r>
           </w:p>
           <w:p>
             <w:pPr>
@@ -4490,57 +4679,16 @@
       </w:tr>
     </w:tbl>
     <w:p>
-      <w:pPr>
-        <w:pStyle w:val="Title"/>
-        <w:spacing w:before="120" w:after="120" w:line="240" w:lineRule="auto"/>
-        <w:rPr>
-          <w:sz w:val="22"/>
-          <w:szCs w:val="22"/>
-        </w:rPr>
-      </w:pPr>
       <w:bookmarkStart w:id="9" w:name="_5f693pz7842s" w:colFirst="0" w:colLast="0"/>
       <w:bookmarkEnd w:id="9"/>
     </w:p>
-    <w:p/>
-    <w:p/>
-    <w:p/>
-    <w:p/>
-    <w:p/>
-    <w:p/>
-    <w:p/>
-    <w:p/>
-    <w:p/>
-    <w:p/>
-    <w:p/>
-    <w:p/>
-    <w:p/>
-    <w:p/>
-    <w:p/>
-    <w:p/>
-    <w:p/>
-    <w:p/>
-    <w:p/>
-    <w:p/>
-    <w:p>
-      <w:pPr>
-        <w:rPr>
-          <w:b/>
-        </w:rPr>
-      </w:pPr>
-    </w:p>
-    <w:p/>
-    <w:p>
-      <w:pPr>
-        <w:jc w:val="center"/>
-      </w:pPr>
-    </w:p>
     <w:sectPr>
-      <w:headerReference w:type="even" r:id="rId7"/>
-      <w:headerReference w:type="default" r:id="rId8"/>
-      <w:footerReference w:type="even" r:id="rId9"/>
-      <w:footerReference w:type="default" r:id="rId10"/>
-      <w:headerReference w:type="first" r:id="rId11"/>
-      <w:footerReference w:type="first" r:id="rId12"/>
+      <w:headerReference w:type="even" r:id="rId14"/>
+      <w:headerReference w:type="default" r:id="rId15"/>
+      <w:footerReference w:type="even" r:id="rId16"/>
+      <w:footerReference w:type="default" r:id="rId17"/>
+      <w:headerReference w:type="first" r:id="rId18"/>
+      <w:footerReference w:type="first" r:id="rId19"/>
       <w:pgSz w:w="11894" w:h="16819"/>
       <w:pgMar w:top="1800" w:right="360" w:bottom="792" w:left="720" w:header="0" w:footer="720" w:gutter="0"/>
       <w:pgNumType w:start="1"/>
@@ -7345,6 +7493,41 @@
       <w:bCs/>
     </w:rPr>
   </w:style>
+  <w:style w:type="character" w:styleId="Hyperlink">
+    <w:name w:val="Hyperlink"/>
+    <w:basedOn w:val="DefaultParagraphFont"/>
+    <w:uiPriority w:val="99"/>
+    <w:unhideWhenUsed/>
+    <w:rsid w:val="003C2BBE"/>
+    <w:rPr>
+      <w:color w:val="0000FF" w:themeColor="hyperlink"/>
+      <w:u w:val="single"/>
+    </w:rPr>
+  </w:style>
+  <w:style w:type="character" w:styleId="UnresolvedMention">
+    <w:name w:val="Unresolved Mention"/>
+    <w:basedOn w:val="DefaultParagraphFont"/>
+    <w:uiPriority w:val="99"/>
+    <w:semiHidden/>
+    <w:unhideWhenUsed/>
+    <w:rsid w:val="003C2BBE"/>
+    <w:rPr>
+      <w:color w:val="605E5C"/>
+      <w:shd w:val="clear" w:color="auto" w:fill="E1DFDD"/>
+    </w:rPr>
+  </w:style>
+  <w:style w:type="character" w:styleId="FollowedHyperlink">
+    <w:name w:val="FollowedHyperlink"/>
+    <w:basedOn w:val="DefaultParagraphFont"/>
+    <w:uiPriority w:val="99"/>
+    <w:semiHidden/>
+    <w:unhideWhenUsed/>
+    <w:rsid w:val="003C2BBE"/>
+    <w:rPr>
+      <w:color w:val="800080" w:themeColor="followedHyperlink"/>
+      <w:u w:val="single"/>
+    </w:rPr>
+  </w:style>
 </w:styles>
 </file>
 

</xml_diff>

<commit_message>
minor edits to attachments
</commit_message>
<xml_diff>
--- a/en/data-mobilization/modules/ROOT/attachments/UC-Practice-exercise-sheet_EN.docx
+++ b/en/data-mobilization/modules/ROOT/attachments/UC-Practice-exercise-sheet_EN.docx
@@ -3487,6 +3487,81 @@
       </w:r>
     </w:p>
     <w:p/>
+    <w:p>
+      <w:r>
+        <w:t xml:space="preserve">Use the following tools: </w:t>
+      </w:r>
+    </w:p>
+    <w:p>
+      <w:pPr>
+        <w:pStyle w:val="ListParagraph"/>
+        <w:numPr>
+          <w:ilvl w:val="0"/>
+          <w:numId w:val="3"/>
+        </w:numPr>
+      </w:pPr>
+      <w:r>
+        <w:t xml:space="preserve">GBIF Name Matching Tool - </w:t>
+      </w:r>
+      <w:hyperlink r:id="rId12" w:history="1">
+        <w:r>
+          <w:rPr>
+            <w:rStyle w:val="Hyperlink"/>
+          </w:rPr>
+          <w:t>https://www.gbif.org/tools/species-lookup</w:t>
+        </w:r>
+      </w:hyperlink>
+      <w:r>
+        <w:t xml:space="preserve"> </w:t>
+      </w:r>
+    </w:p>
+    <w:p>
+      <w:pPr>
+        <w:pStyle w:val="ListParagraph"/>
+        <w:numPr>
+          <w:ilvl w:val="0"/>
+          <w:numId w:val="3"/>
+        </w:numPr>
+      </w:pPr>
+      <w:r>
+        <w:t xml:space="preserve">Canadensys Coordinate Converter - </w:t>
+      </w:r>
+      <w:hyperlink r:id="rId13" w:history="1">
+        <w:r>
+          <w:rPr>
+            <w:rStyle w:val="Hyperlink"/>
+          </w:rPr>
+          <w:t>http://data.canadensys.net/tools/coordinates</w:t>
+        </w:r>
+      </w:hyperlink>
+      <w:r>
+        <w:t xml:space="preserve"> </w:t>
+      </w:r>
+    </w:p>
+    <w:p>
+      <w:pPr>
+        <w:pStyle w:val="ListParagraph"/>
+        <w:numPr>
+          <w:ilvl w:val="0"/>
+          <w:numId w:val="3"/>
+        </w:numPr>
+      </w:pPr>
+      <w:r>
+        <w:t xml:space="preserve">InfoXY - </w:t>
+      </w:r>
+      <w:hyperlink r:id="rId14" w:history="1">
+        <w:r>
+          <w:rPr>
+            <w:rStyle w:val="Hyperlink"/>
+          </w:rPr>
+          <w:t>http://splink.cria.org.br/infoxy?criaLANG=en</w:t>
+        </w:r>
+      </w:hyperlink>
+      <w:r>
+        <w:t xml:space="preserve"> </w:t>
+      </w:r>
+    </w:p>
+    <w:p/>
     <w:tbl>
       <w:tblPr>
         <w:tblStyle w:val="a4"/>
@@ -4342,7 +4417,7 @@
       <w:r>
         <w:t xml:space="preserve"> - </w:t>
       </w:r>
-      <w:hyperlink r:id="rId12" w:history="1">
+      <w:hyperlink r:id="rId15" w:history="1">
         <w:r>
           <w:rPr>
             <w:rStyle w:val="Hyperlink"/>
@@ -4451,29 +4526,16 @@
     </w:tbl>
     <w:p>
       <w:pPr>
-        <w:pStyle w:val="Heading1"/>
-        <w:spacing w:before="120" w:line="240" w:lineRule="auto"/>
-        <w:rPr>
-          <w:sz w:val="22"/>
-          <w:szCs w:val="22"/>
-        </w:rPr>
-      </w:pPr>
-      <w:bookmarkStart w:id="7" w:name="_wfnxqqqyau94" w:colFirst="0" w:colLast="0"/>
-      <w:bookmarkEnd w:id="7"/>
-    </w:p>
-    <w:p>
-      <w:pPr>
         <w:rPr>
           <w:b/>
           <w:sz w:val="28"/>
           <w:szCs w:val="28"/>
         </w:rPr>
       </w:pPr>
+      <w:bookmarkStart w:id="7" w:name="_wfnxqqqyau94" w:colFirst="0" w:colLast="0"/>
       <w:bookmarkStart w:id="8" w:name="_cgwq6qr1hnm0" w:colFirst="0" w:colLast="0"/>
+      <w:bookmarkEnd w:id="7"/>
       <w:bookmarkEnd w:id="8"/>
-      <w:r>
-        <w:br w:type="page"/>
-      </w:r>
     </w:p>
     <w:p>
       <w:pPr>
@@ -4493,7 +4555,7 @@
       <w:r>
         <w:t xml:space="preserve"> - </w:t>
       </w:r>
-      <w:hyperlink r:id="rId13" w:history="1">
+      <w:hyperlink r:id="rId16" w:history="1">
         <w:r>
           <w:rPr>
             <w:rStyle w:val="Hyperlink"/>
@@ -4683,12 +4745,12 @@
       <w:bookmarkEnd w:id="9"/>
     </w:p>
     <w:sectPr>
-      <w:headerReference w:type="even" r:id="rId14"/>
-      <w:headerReference w:type="default" r:id="rId15"/>
-      <w:footerReference w:type="even" r:id="rId16"/>
-      <w:footerReference w:type="default" r:id="rId17"/>
-      <w:headerReference w:type="first" r:id="rId18"/>
-      <w:footerReference w:type="first" r:id="rId19"/>
+      <w:headerReference w:type="even" r:id="rId17"/>
+      <w:headerReference w:type="default" r:id="rId18"/>
+      <w:footerReference w:type="even" r:id="rId19"/>
+      <w:footerReference w:type="default" r:id="rId20"/>
+      <w:headerReference w:type="first" r:id="rId21"/>
+      <w:footerReference w:type="first" r:id="rId22"/>
       <w:pgSz w:w="11894" w:h="16819"/>
       <w:pgMar w:top="1800" w:right="360" w:bottom="792" w:left="720" w:header="0" w:footer="720" w:gutter="0"/>
       <w:pgNumType w:start="1"/>
@@ -5371,6 +5433,119 @@
 <file path=word/numbering.xml><?xml version="1.0" encoding="utf-8"?>
 <w:numbering xmlns:wpc="http://schemas.microsoft.com/office/word/2010/wordprocessingCanvas" xmlns:cx="http://schemas.microsoft.com/office/drawing/2014/chartex" xmlns:cx1="http://schemas.microsoft.com/office/drawing/2015/9/8/chartex" xmlns:cx2="http://schemas.microsoft.com/office/drawing/2015/10/21/chartex" xmlns:cx3="http://schemas.microsoft.com/office/drawing/2016/5/9/chartex" xmlns:cx4="http://schemas.microsoft.com/office/drawing/2016/5/10/chartex" xmlns:cx5="http://schemas.microsoft.com/office/drawing/2016/5/11/chartex" xmlns:cx6="http://schemas.microsoft.com/office/drawing/2016/5/12/chartex" xmlns:cx7="http://schemas.microsoft.com/office/drawing/2016/5/13/chartex" xmlns:cx8="http://schemas.microsoft.com/office/drawing/2016/5/14/chartex" xmlns:mc="http://schemas.openxmlformats.org/markup-compatibility/2006" xmlns:aink="http://schemas.microsoft.com/office/drawing/2016/ink" xmlns:am3d="http://schemas.microsoft.com/office/drawing/2017/model3d" xmlns:o="urn:schemas-microsoft-com:office:office" xmlns:oel="http://schemas.microsoft.com/office/2019/extlst" xmlns:r="http://schemas.openxmlformats.org/officeDocument/2006/relationships" xmlns:m="http://schemas.openxmlformats.org/officeDocument/2006/math" xmlns:v="urn:schemas-microsoft-com:vml" xmlns:wp14="http://schemas.microsoft.com/office/word/2010/wordprocessingDrawing" xmlns:wp="http://schemas.openxmlformats.org/drawingml/2006/wordprocessingDrawing" xmlns:w10="urn:schemas-microsoft-com:office:word" xmlns:w="http://schemas.openxmlformats.org/wordprocessingml/2006/main" xmlns:w14="http://schemas.microsoft.com/office/word/2010/wordml" xmlns:w15="http://schemas.microsoft.com/office/word/2012/wordml" xmlns:w16cex="http://schemas.microsoft.com/office/word/2018/wordml/cex" xmlns:w16cid="http://schemas.microsoft.com/office/word/2016/wordml/cid" xmlns:w16="http://schemas.microsoft.com/office/word/2018/wordml" xmlns:w16du="http://schemas.microsoft.com/office/word/2023/wordml/word16du" xmlns:w16sdtdh="http://schemas.microsoft.com/office/word/2020/wordml/sdtdatahash" xmlns:w16sdtfl="http://schemas.microsoft.com/office/word/2024/wordml/sdtformatlock" xmlns:w16se="http://schemas.microsoft.com/office/word/2015/wordml/symex" xmlns:wpg="http://schemas.microsoft.com/office/word/2010/wordprocessingGroup" xmlns:wpi="http://schemas.microsoft.com/office/word/2010/wordprocessingInk" xmlns:wne="http://schemas.microsoft.com/office/word/2006/wordml" xmlns:wps="http://schemas.microsoft.com/office/word/2010/wordprocessingShape" mc:Ignorable="w14 w15 w16se w16cid w16 w16cex w16sdtdh w16sdtfl w16du wp14">
   <w:abstractNum w:abstractNumId="0" w15:restartNumberingAfterBreak="0">
+    <w:nsid w:val="2D8928D7"/>
+    <w:multiLevelType w:val="hybridMultilevel"/>
+    <w:tmpl w:val="F0D60804"/>
+    <w:lvl w:ilvl="0" w:tplc="04090001">
+      <w:start w:val="1"/>
+      <w:numFmt w:val="bullet"/>
+      <w:lvlText w:val=""/>
+      <w:lvlJc w:val="left"/>
+      <w:pPr>
+        <w:ind w:left="720" w:hanging="360"/>
+      </w:pPr>
+      <w:rPr>
+        <w:rFonts w:ascii="Symbol" w:hAnsi="Symbol" w:hint="default"/>
+      </w:rPr>
+    </w:lvl>
+    <w:lvl w:ilvl="1" w:tplc="04090003" w:tentative="1">
+      <w:start w:val="1"/>
+      <w:numFmt w:val="bullet"/>
+      <w:lvlText w:val="o"/>
+      <w:lvlJc w:val="left"/>
+      <w:pPr>
+        <w:ind w:left="1440" w:hanging="360"/>
+      </w:pPr>
+      <w:rPr>
+        <w:rFonts w:ascii="Courier New" w:hAnsi="Courier New" w:cs="Courier New" w:hint="default"/>
+      </w:rPr>
+    </w:lvl>
+    <w:lvl w:ilvl="2" w:tplc="04090005" w:tentative="1">
+      <w:start w:val="1"/>
+      <w:numFmt w:val="bullet"/>
+      <w:lvlText w:val=""/>
+      <w:lvlJc w:val="left"/>
+      <w:pPr>
+        <w:ind w:left="2160" w:hanging="360"/>
+      </w:pPr>
+      <w:rPr>
+        <w:rFonts w:ascii="Wingdings" w:hAnsi="Wingdings" w:hint="default"/>
+      </w:rPr>
+    </w:lvl>
+    <w:lvl w:ilvl="3" w:tplc="04090001" w:tentative="1">
+      <w:start w:val="1"/>
+      <w:numFmt w:val="bullet"/>
+      <w:lvlText w:val=""/>
+      <w:lvlJc w:val="left"/>
+      <w:pPr>
+        <w:ind w:left="2880" w:hanging="360"/>
+      </w:pPr>
+      <w:rPr>
+        <w:rFonts w:ascii="Symbol" w:hAnsi="Symbol" w:hint="default"/>
+      </w:rPr>
+    </w:lvl>
+    <w:lvl w:ilvl="4" w:tplc="04090003" w:tentative="1">
+      <w:start w:val="1"/>
+      <w:numFmt w:val="bullet"/>
+      <w:lvlText w:val="o"/>
+      <w:lvlJc w:val="left"/>
+      <w:pPr>
+        <w:ind w:left="3600" w:hanging="360"/>
+      </w:pPr>
+      <w:rPr>
+        <w:rFonts w:ascii="Courier New" w:hAnsi="Courier New" w:cs="Courier New" w:hint="default"/>
+      </w:rPr>
+    </w:lvl>
+    <w:lvl w:ilvl="5" w:tplc="04090005" w:tentative="1">
+      <w:start w:val="1"/>
+      <w:numFmt w:val="bullet"/>
+      <w:lvlText w:val=""/>
+      <w:lvlJc w:val="left"/>
+      <w:pPr>
+        <w:ind w:left="4320" w:hanging="360"/>
+      </w:pPr>
+      <w:rPr>
+        <w:rFonts w:ascii="Wingdings" w:hAnsi="Wingdings" w:hint="default"/>
+      </w:rPr>
+    </w:lvl>
+    <w:lvl w:ilvl="6" w:tplc="04090001" w:tentative="1">
+      <w:start w:val="1"/>
+      <w:numFmt w:val="bullet"/>
+      <w:lvlText w:val=""/>
+      <w:lvlJc w:val="left"/>
+      <w:pPr>
+        <w:ind w:left="5040" w:hanging="360"/>
+      </w:pPr>
+      <w:rPr>
+        <w:rFonts w:ascii="Symbol" w:hAnsi="Symbol" w:hint="default"/>
+      </w:rPr>
+    </w:lvl>
+    <w:lvl w:ilvl="7" w:tplc="04090003" w:tentative="1">
+      <w:start w:val="1"/>
+      <w:numFmt w:val="bullet"/>
+      <w:lvlText w:val="o"/>
+      <w:lvlJc w:val="left"/>
+      <w:pPr>
+        <w:ind w:left="5760" w:hanging="360"/>
+      </w:pPr>
+      <w:rPr>
+        <w:rFonts w:ascii="Courier New" w:hAnsi="Courier New" w:cs="Courier New" w:hint="default"/>
+      </w:rPr>
+    </w:lvl>
+    <w:lvl w:ilvl="8" w:tplc="04090005" w:tentative="1">
+      <w:start w:val="1"/>
+      <w:numFmt w:val="bullet"/>
+      <w:lvlText w:val=""/>
+      <w:lvlJc w:val="left"/>
+      <w:pPr>
+        <w:ind w:left="6480" w:hanging="360"/>
+      </w:pPr>
+      <w:rPr>
+        <w:rFonts w:ascii="Wingdings" w:hAnsi="Wingdings" w:hint="default"/>
+      </w:rPr>
+    </w:lvl>
+  </w:abstractNum>
+  <w:abstractNum w:abstractNumId="1" w15:restartNumberingAfterBreak="0">
     <w:nsid w:val="54C41C18"/>
     <w:multiLevelType w:val="multilevel"/>
     <w:tmpl w:val="E7E0184C"/>
@@ -5519,7 +5694,7 @@
       </w:rPr>
     </w:lvl>
   </w:abstractNum>
-  <w:abstractNum w:abstractNumId="1" w15:restartNumberingAfterBreak="0">
+  <w:abstractNum w:abstractNumId="2" w15:restartNumberingAfterBreak="0">
     <w:nsid w:val="6DB177E5"/>
     <w:multiLevelType w:val="multilevel"/>
     <w:tmpl w:val="B7943A5E"/>
@@ -5669,9 +5844,12 @@
     </w:lvl>
   </w:abstractNum>
   <w:num w:numId="1" w16cid:durableId="1412119154">
+    <w:abstractNumId w:val="2"/>
+  </w:num>
+  <w:num w:numId="2" w16cid:durableId="771360536">
     <w:abstractNumId w:val="1"/>
   </w:num>
-  <w:num w:numId="2" w16cid:durableId="771360536">
+  <w:num w:numId="3" w16cid:durableId="331808771">
     <w:abstractNumId w:val="0"/>
   </w:num>
 </w:numbering>
@@ -7528,6 +7706,17 @@
       <w:u w:val="single"/>
     </w:rPr>
   </w:style>
+  <w:style w:type="paragraph" w:styleId="ListParagraph">
+    <w:name w:val="List Paragraph"/>
+    <w:basedOn w:val="Normal"/>
+    <w:uiPriority w:val="34"/>
+    <w:qFormat/>
+    <w:rsid w:val="00763D19"/>
+    <w:pPr>
+      <w:ind w:left="720"/>
+      <w:contextualSpacing/>
+    </w:pPr>
+  </w:style>
 </w:styles>
 </file>
 

</xml_diff>